<commit_message>
26-08-27, Strijd om ideeën aangepast.
</commit_message>
<xml_diff>
--- a/BlogsWord/Strijd_om_ideeen.docx
+++ b/BlogsWord/Strijd_om_ideeen.docx
@@ -297,7 +297,21 @@
           <w:rFonts w:ascii="Courier New" w:hAnsi="Courier New" w:cs="Courier New"/>
           <w:lang w:val="nl-NL"/>
         </w:rPr>
-        <w:t xml:space="preserve">alleen </w:t>
+        <w:t>alleen</w:t>
+      </w:r>
+      <w:r>
+        <w:rPr>
+          <w:rFonts w:ascii="Courier New" w:hAnsi="Courier New" w:cs="Courier New"/>
+          <w:lang w:val="nl-NL"/>
+        </w:rPr>
+        <w:t xml:space="preserve"> maar</w:t>
+      </w:r>
+      <w:r>
+        <w:rPr>
+          <w:rFonts w:ascii="Courier New" w:hAnsi="Courier New" w:cs="Courier New"/>
+          <w:lang w:val="nl-NL"/>
+        </w:rPr>
+        <w:t xml:space="preserve"> </w:t>
       </w:r>
       <w:r>
         <w:rPr>
@@ -355,21 +369,49 @@
           <w:rFonts w:ascii="Courier New" w:hAnsi="Courier New" w:cs="Courier New"/>
           <w:lang w:val="nl-NL"/>
         </w:rPr>
-        <w:t xml:space="preserve"> landschap </w:t>
-      </w:r>
-      <w:r>
-        <w:rPr>
-          <w:rFonts w:ascii="Courier New" w:hAnsi="Courier New" w:cs="Courier New"/>
-          <w:lang w:val="nl-NL"/>
-        </w:rPr>
-        <w:t xml:space="preserve">wereld </w:t>
-      </w:r>
-      <w:r>
-        <w:rPr>
-          <w:rFonts w:ascii="Courier New" w:hAnsi="Courier New" w:cs="Courier New"/>
-          <w:lang w:val="nl-NL"/>
-        </w:rPr>
-        <w:t xml:space="preserve">van denkers, activisten en instellingen die proberen een ideologische rechtvaardiging te geven voor een fundamentele verandering van de Amerikaanse politieke </w:t>
+        <w:t xml:space="preserve"> </w:t>
+      </w:r>
+      <w:r>
+        <w:rPr>
+          <w:rFonts w:ascii="Courier New" w:hAnsi="Courier New" w:cs="Courier New"/>
+          <w:lang w:val="nl-NL"/>
+        </w:rPr>
+        <w:t>ideeënwereld</w:t>
+      </w:r>
+      <w:r>
+        <w:rPr>
+          <w:rFonts w:ascii="Courier New" w:hAnsi="Courier New" w:cs="Courier New"/>
+          <w:lang w:val="nl-NL"/>
+        </w:rPr>
+        <w:t xml:space="preserve"> </w:t>
+      </w:r>
+      <w:r>
+        <w:rPr>
+          <w:rFonts w:ascii="Courier New" w:hAnsi="Courier New" w:cs="Courier New"/>
+          <w:lang w:val="nl-NL"/>
+        </w:rPr>
+        <w:t>waar</w:t>
+      </w:r>
+      <w:r>
+        <w:rPr>
+          <w:rFonts w:ascii="Courier New" w:hAnsi="Courier New" w:cs="Courier New"/>
+          <w:lang w:val="nl-NL"/>
+        </w:rPr>
+        <w:t xml:space="preserve"> denkers, activisten en instellingen </w:t>
+      </w:r>
+      <w:r>
+        <w:rPr>
+          <w:rFonts w:ascii="Courier New" w:hAnsi="Courier New" w:cs="Courier New"/>
+          <w:lang w:val="nl-NL"/>
+        </w:rPr>
+        <w:t xml:space="preserve">achter zitten </w:t>
+      </w:r>
+      <w:r>
+        <w:rPr>
+          <w:rFonts w:ascii="Courier New" w:hAnsi="Courier New" w:cs="Courier New"/>
+          <w:lang w:val="nl-NL"/>
+        </w:rPr>
+        <w:t xml:space="preserve">die proberen een ideologische rechtvaardiging te geven voor een fundamentele verandering van de Amerikaanse politieke </w:t>
       </w:r>
       <w:r>
         <w:rPr>
@@ -446,14 +488,14 @@
           <w:rFonts w:ascii="Courier New" w:hAnsi="Courier New" w:cs="Courier New"/>
           <w:lang w:val="nl-NL"/>
         </w:rPr>
-        <w:t xml:space="preserve">met elkaar </w:t>
-      </w:r>
-      <w:r>
-        <w:rPr>
-          <w:rFonts w:ascii="Courier New" w:hAnsi="Courier New" w:cs="Courier New"/>
-          <w:lang w:val="nl-NL"/>
-        </w:rPr>
-        <w:t>een afkeer van belangrijke elementen van het naoorlogse Amerikaanse liberalisme.</w:t>
+        <w:t xml:space="preserve">elkaars </w:t>
+      </w:r>
+      <w:r>
+        <w:rPr>
+          <w:rFonts w:ascii="Courier New" w:hAnsi="Courier New" w:cs="Courier New"/>
+          <w:lang w:val="nl-NL"/>
+        </w:rPr>
+        <w:t>afkeer van belangrijke elementen van het naoorlogse Amerikaanse liberalisme.</w:t>
       </w:r>
       <w:r>
         <w:rPr>
@@ -502,7 +544,21 @@
           <w:rFonts w:ascii="Courier New" w:hAnsi="Courier New" w:cs="Courier New"/>
           <w:lang w:val="nl-NL"/>
         </w:rPr>
-        <w:t xml:space="preserve">. Zo kon ze </w:t>
+        <w:t xml:space="preserve">. </w:t>
+      </w:r>
+      <w:r>
+        <w:rPr>
+          <w:rFonts w:ascii="Courier New" w:hAnsi="Courier New" w:cs="Courier New"/>
+          <w:lang w:val="nl-NL"/>
+        </w:rPr>
+        <w:t>Met die achtergrond</w:t>
+      </w:r>
+      <w:r>
+        <w:rPr>
+          <w:rFonts w:ascii="Courier New" w:hAnsi="Courier New" w:cs="Courier New"/>
+          <w:lang w:val="nl-NL"/>
+        </w:rPr>
+        <w:t xml:space="preserve"> kon ze </w:t>
       </w:r>
       <w:r>
         <w:rPr>
@@ -516,14 +572,28 @@
           <w:rFonts w:ascii="Courier New" w:hAnsi="Courier New" w:cs="Courier New"/>
           <w:lang w:val="nl-NL"/>
         </w:rPr>
-        <w:t xml:space="preserve"> Zij heeft er </w:t>
-      </w:r>
-      <w:r>
-        <w:rPr>
-          <w:rFonts w:ascii="Courier New" w:hAnsi="Courier New" w:cs="Courier New"/>
-          <w:lang w:val="nl-NL"/>
-        </w:rPr>
-        <w:t xml:space="preserve">ondertussen </w:t>
+        <w:t xml:space="preserve"> Zij heeft </w:t>
+      </w:r>
+      <w:r>
+        <w:rPr>
+          <w:rFonts w:ascii="Courier New" w:hAnsi="Courier New" w:cs="Courier New"/>
+          <w:lang w:val="nl-NL"/>
+        </w:rPr>
+        <w:t>ondertussen</w:t>
+      </w:r>
+      <w:r>
+        <w:rPr>
+          <w:rFonts w:ascii="Courier New" w:hAnsi="Courier New" w:cs="Courier New"/>
+          <w:lang w:val="nl-NL"/>
+        </w:rPr>
+        <w:t xml:space="preserve"> van die conservatieve</w:t>
+      </w:r>
+      <w:r>
+        <w:rPr>
+          <w:rFonts w:ascii="Courier New" w:hAnsi="Courier New" w:cs="Courier New"/>
+          <w:lang w:val="nl-NL"/>
+        </w:rPr>
+        <w:t xml:space="preserve"> </w:t>
       </w:r>
       <w:r>
         <w:rPr>
@@ -537,7 +607,21 @@
           <w:rFonts w:ascii="Courier New" w:hAnsi="Courier New" w:cs="Courier New"/>
           <w:lang w:val="nl-NL"/>
         </w:rPr>
-        <w:t xml:space="preserve"> en rekent zichzelf tot de liberalen.</w:t>
+        <w:t xml:space="preserve"> en rekent zichzelf tot de liberalen</w:t>
+      </w:r>
+      <w:r>
+        <w:rPr>
+          <w:rFonts w:ascii="Courier New" w:hAnsi="Courier New" w:cs="Courier New"/>
+          <w:lang w:val="nl-NL"/>
+        </w:rPr>
+        <w:t xml:space="preserve"> (een liberaal die geniet ‘van het voorrecht van het gewone liefdesverdriet’, zoals Mandelstam dat zo mooi had geschreven, en een politiek die dat mogelijk had gemaakt)</w:t>
+      </w:r>
+      <w:r>
+        <w:rPr>
+          <w:rFonts w:ascii="Courier New" w:hAnsi="Courier New" w:cs="Courier New"/>
+          <w:lang w:val="nl-NL"/>
+        </w:rPr>
+        <w:t>.</w:t>
       </w:r>
       <w:r>
         <w:rPr>
@@ -561,6 +645,7 @@
           <w:rFonts w:ascii="Courier New" w:hAnsi="Courier New" w:cs="Courier New"/>
           <w:lang w:val="nl-NL"/>
         </w:rPr>
+        <w:lastRenderedPageBreak/>
         <w:t xml:space="preserve">Na de bestorming van het Capitool op 6 januari 2021 verwachtte </w:t>
       </w:r>
       <w:r>
@@ -575,7 +660,21 @@
           <w:rFonts w:ascii="Courier New" w:hAnsi="Courier New" w:cs="Courier New"/>
           <w:lang w:val="nl-NL"/>
         </w:rPr>
-        <w:t xml:space="preserve"> dat deze intellectuele beweging haar aantrekkingskracht zou verliezen</w:t>
+        <w:t xml:space="preserve"> dat deze intellectuele </w:t>
+      </w:r>
+      <w:r>
+        <w:rPr>
+          <w:rFonts w:ascii="Courier New" w:hAnsi="Courier New" w:cs="Courier New"/>
+          <w:lang w:val="nl-NL"/>
+        </w:rPr>
+        <w:t>ideeën</w:t>
+      </w:r>
+      <w:r>
+        <w:rPr>
+          <w:rFonts w:ascii="Courier New" w:hAnsi="Courier New" w:cs="Courier New"/>
+          <w:lang w:val="nl-NL"/>
+        </w:rPr>
+        <w:t>beweging haar aantrekkingskracht zou verliezen</w:t>
       </w:r>
       <w:r>
         <w:rPr>
@@ -596,6 +695,20 @@
           <w:rFonts w:ascii="Courier New" w:hAnsi="Courier New" w:cs="Courier New"/>
           <w:lang w:val="nl-NL"/>
         </w:rPr>
+        <w:t xml:space="preserve"> en ze besloot er een boek over</w:t>
+      </w:r>
+      <w:r>
+        <w:rPr>
+          <w:rFonts w:ascii="Courier New" w:hAnsi="Courier New" w:cs="Courier New"/>
+          <w:lang w:val="nl-NL"/>
+        </w:rPr>
+        <w:t xml:space="preserve"> te schrijven.</w:t>
+      </w:r>
+      <w:r>
+        <w:rPr>
+          <w:rFonts w:ascii="Courier New" w:hAnsi="Courier New" w:cs="Courier New"/>
+          <w:lang w:val="nl-NL"/>
+        </w:rPr>
         <w:t xml:space="preserve"> </w:t>
       </w:r>
       <w:r>
@@ -603,29 +716,101 @@
           <w:rFonts w:ascii="Courier New" w:hAnsi="Courier New" w:cs="Courier New"/>
           <w:lang w:val="nl-NL"/>
         </w:rPr>
-        <w:lastRenderedPageBreak/>
-        <w:t>en ze besloot er een boek over</w:t>
-      </w:r>
-      <w:r>
-        <w:rPr>
-          <w:rFonts w:ascii="Courier New" w:hAnsi="Courier New" w:cs="Courier New"/>
-          <w:lang w:val="nl-NL"/>
-        </w:rPr>
-        <w:t xml:space="preserve"> te schrijven.</w:t>
-      </w:r>
-      <w:r>
-        <w:rPr>
-          <w:rFonts w:ascii="Courier New" w:hAnsi="Courier New" w:cs="Courier New"/>
+        <w:t xml:space="preserve">Field volgt </w:t>
+      </w:r>
+      <w:r>
+        <w:rPr>
+          <w:rFonts w:ascii="Courier New" w:hAnsi="Courier New" w:cs="Courier New"/>
+          <w:lang w:val="nl-NL"/>
+        </w:rPr>
+        <w:t xml:space="preserve">in </w:t>
+      </w:r>
+      <w:proofErr w:type="spellStart"/>
+      <w:r>
+        <w:rPr>
+          <w:rFonts w:ascii="Courier New" w:hAnsi="Courier New" w:cs="Courier New"/>
+          <w:i/>
+          <w:iCs/>
+          <w:lang w:val="nl-NL"/>
+        </w:rPr>
+        <w:t>Furious</w:t>
+      </w:r>
+      <w:proofErr w:type="spellEnd"/>
+      <w:r>
+        <w:rPr>
+          <w:rFonts w:ascii="Courier New" w:hAnsi="Courier New" w:cs="Courier New"/>
+          <w:i/>
+          <w:iCs/>
           <w:lang w:val="nl-NL"/>
         </w:rPr>
         <w:t xml:space="preserve"> </w:t>
       </w:r>
-      <w:r>
-        <w:rPr>
-          <w:rFonts w:ascii="Courier New" w:hAnsi="Courier New" w:cs="Courier New"/>
-          <w:lang w:val="nl-NL"/>
-        </w:rPr>
-        <w:t>Field volgt de ontwikkeling van de beweging min of meer chronologisch en combineert politieke geschiedenis met portretten van belangrijke personen. Haar doel is niet alleen de ideeën van de beweging te bekritiseren, maar ze eerst zo helder en serieus mogelijk weer te geven.</w:t>
+      <w:proofErr w:type="spellStart"/>
+      <w:r>
+        <w:rPr>
+          <w:rFonts w:ascii="Courier New" w:hAnsi="Courier New" w:cs="Courier New"/>
+          <w:i/>
+          <w:iCs/>
+          <w:lang w:val="nl-NL"/>
+        </w:rPr>
+        <w:t>Minds</w:t>
+      </w:r>
+      <w:proofErr w:type="spellEnd"/>
+      <w:r>
+        <w:rPr>
+          <w:rFonts w:ascii="Courier New" w:hAnsi="Courier New" w:cs="Courier New"/>
+          <w:lang w:val="nl-NL"/>
+        </w:rPr>
+        <w:t xml:space="preserve"> </w:t>
+      </w:r>
+      <w:r>
+        <w:rPr>
+          <w:rFonts w:ascii="Courier New" w:hAnsi="Courier New" w:cs="Courier New"/>
+          <w:lang w:val="nl-NL"/>
+        </w:rPr>
+        <w:t>de ontwikkeling van de</w:t>
+      </w:r>
+      <w:r>
+        <w:rPr>
+          <w:rFonts w:ascii="Courier New" w:hAnsi="Courier New" w:cs="Courier New"/>
+          <w:lang w:val="nl-NL"/>
+        </w:rPr>
+        <w:t>ze</w:t>
+      </w:r>
+      <w:r>
+        <w:rPr>
+          <w:rFonts w:ascii="Courier New" w:hAnsi="Courier New" w:cs="Courier New"/>
+          <w:lang w:val="nl-NL"/>
+        </w:rPr>
+        <w:t xml:space="preserve"> beweging min of meer chronologisch en combineert politieke geschiedenis met portretten van </w:t>
+      </w:r>
+      <w:r>
+        <w:rPr>
+          <w:rFonts w:ascii="Courier New" w:hAnsi="Courier New" w:cs="Courier New"/>
+          <w:lang w:val="nl-NL"/>
+        </w:rPr>
+        <w:t xml:space="preserve">talloze </w:t>
+      </w:r>
+      <w:r>
+        <w:rPr>
+          <w:rFonts w:ascii="Courier New" w:hAnsi="Courier New" w:cs="Courier New"/>
+          <w:lang w:val="nl-NL"/>
+        </w:rPr>
+        <w:t>belangrijke personen</w:t>
+      </w:r>
+      <w:r>
+        <w:rPr>
+          <w:rFonts w:ascii="Courier New" w:hAnsi="Courier New" w:cs="Courier New"/>
+          <w:lang w:val="nl-NL"/>
+        </w:rPr>
+        <w:t xml:space="preserve"> hierin</w:t>
+      </w:r>
+      <w:r>
+        <w:rPr>
+          <w:rFonts w:ascii="Courier New" w:hAnsi="Courier New" w:cs="Courier New"/>
+          <w:lang w:val="nl-NL"/>
+        </w:rPr>
+        <w:t>. Haar doel is niet alleen de ideeën van de beweging te bekritiseren, maar ze eerst zo helder en serieus mogelijk weer te geven.</w:t>
       </w:r>
       <w:r>
         <w:rPr>
@@ -660,7 +845,7 @@
           <w:rFonts w:ascii="Courier New" w:hAnsi="Courier New" w:cs="Courier New"/>
           <w:lang w:val="nl-NL"/>
         </w:rPr>
-        <w:t>.</w:t>
+        <w:t xml:space="preserve"> en gelukkig neemt Field jou hierbij aan de hand.</w:t>
       </w:r>
       <w:r>
         <w:rPr>
@@ -836,7 +1021,21 @@
           <w:rFonts w:ascii="Courier New" w:hAnsi="Courier New" w:cs="Courier New"/>
           <w:lang w:val="nl-NL"/>
         </w:rPr>
-        <w:t xml:space="preserve">e drie poten van Reagans conservatisme. </w:t>
+        <w:t xml:space="preserve">e </w:t>
+      </w:r>
+      <w:r>
+        <w:rPr>
+          <w:rFonts w:ascii="Courier New" w:hAnsi="Courier New" w:cs="Courier New"/>
+          <w:lang w:val="nl-NL"/>
+        </w:rPr>
+        <w:t xml:space="preserve">stoel met </w:t>
+      </w:r>
+      <w:r>
+        <w:rPr>
+          <w:rFonts w:ascii="Courier New" w:hAnsi="Courier New" w:cs="Courier New"/>
+          <w:lang w:val="nl-NL"/>
+        </w:rPr>
+        <w:t xml:space="preserve">drie poten van Reagans conservatisme. </w:t>
       </w:r>
       <w:r>
         <w:rPr>
@@ -1101,7 +1300,38 @@
           <w:rFonts w:ascii="Courier New" w:hAnsi="Courier New" w:cs="Courier New"/>
           <w:lang w:val="nl-NL"/>
         </w:rPr>
-        <w:t xml:space="preserve">. Het vertrouwen in de vrije markt maakt plaats voor economisch nationalisme en protectionisme. Sociaal conservatisme blijft belangrijk, maar wordt volgens Field reactionairder en sterker gericht op het herstellen van traditionele maatschappelijke en genderverhoudingen. </w:t>
+        <w:t xml:space="preserve">. </w:t>
+      </w:r>
+      <w:r>
+        <w:rPr>
+          <w:rFonts w:ascii="Courier New" w:hAnsi="Courier New" w:cs="Courier New"/>
+          <w:lang w:val="nl-NL"/>
+        </w:rPr>
+        <w:t xml:space="preserve">De nieuwe stoel heeft vier poten. </w:t>
+      </w:r>
+      <w:proofErr w:type="spellStart"/>
+      <w:r>
+        <w:rPr>
+          <w:rFonts w:ascii="Courier New" w:hAnsi="Courier New" w:cs="Courier New"/>
+          <w:lang w:val="nl-NL"/>
+        </w:rPr>
+        <w:t>Het</w:t>
+      </w:r>
+      <w:proofErr w:type="spellEnd"/>
+      <w:r>
+        <w:rPr>
+          <w:rFonts w:ascii="Courier New" w:hAnsi="Courier New" w:cs="Courier New"/>
+          <w:lang w:val="nl-NL"/>
+        </w:rPr>
+        <w:t xml:space="preserve"> vertrouwen in de vrije markt maakt plaats voor economisch nationalisme en protectionisme. Sociaal conservatisme </w:t>
+      </w:r>
+      <w:r>
+        <w:rPr>
+          <w:rFonts w:ascii="Courier New" w:hAnsi="Courier New" w:cs="Courier New"/>
+          <w:lang w:val="nl-NL"/>
+        </w:rPr>
+        <w:lastRenderedPageBreak/>
+        <w:t xml:space="preserve">blijft belangrijk, maar wordt volgens Field reactionairder en sterker gericht op het herstellen van traditionele maatschappelijke en genderverhoudingen. </w:t>
       </w:r>
       <w:r>
         <w:rPr>
@@ -1115,15 +1345,7 @@
           <w:rFonts w:ascii="Courier New" w:hAnsi="Courier New" w:cs="Courier New"/>
           <w:lang w:val="nl-NL"/>
         </w:rPr>
-        <w:t xml:space="preserve">mmigratie wordt bovendien een centraal politiek probleem. De bescherming van de grens is verbonden met de wens een traditionele Amerikaanse nationale identiteit te </w:t>
-      </w:r>
-      <w:r>
-        <w:rPr>
-          <w:rFonts w:ascii="Courier New" w:hAnsi="Courier New" w:cs="Courier New"/>
-          <w:lang w:val="nl-NL"/>
-        </w:rPr>
-        <w:lastRenderedPageBreak/>
-        <w:t>behouden.</w:t>
+        <w:t>mmigratie wordt bovendien een centraal politiek probleem. De bescherming van de grens is verbonden met de wens een traditionele Amerikaanse nationale identiteit te behouden.</w:t>
       </w:r>
       <w:r>
         <w:rPr>
@@ -1195,21 +1417,49 @@
           <w:rFonts w:ascii="Courier New" w:hAnsi="Courier New" w:cs="Courier New"/>
           <w:lang w:val="nl-NL"/>
         </w:rPr>
-        <w:t xml:space="preserve"> populisme. De beweging is daarom niet alleen een radicalere versie van het vroegere Amerikaanse conservatisme</w:t>
-      </w:r>
-      <w:r>
-        <w:rPr>
-          <w:rFonts w:ascii="Courier New" w:hAnsi="Courier New" w:cs="Courier New"/>
-          <w:lang w:val="nl-NL"/>
-        </w:rPr>
-        <w:t>, z</w:t>
-      </w:r>
-      <w:r>
-        <w:rPr>
-          <w:rFonts w:ascii="Courier New" w:hAnsi="Courier New" w:cs="Courier New"/>
-          <w:lang w:val="nl-NL"/>
-        </w:rPr>
-        <w:t>ij stelt bepaalde grondbeginselen van het liberale politieke systeem</w:t>
+        <w:t xml:space="preserve"> populisme. De beweging is niet alleen een radicalere versie van het vroegere Amerikaanse conservatisme</w:t>
+      </w:r>
+      <w:r>
+        <w:rPr>
+          <w:rFonts w:ascii="Courier New" w:hAnsi="Courier New" w:cs="Courier New"/>
+          <w:lang w:val="nl-NL"/>
+        </w:rPr>
+        <w:t>. Er komt iets bij.</w:t>
+      </w:r>
+      <w:r>
+        <w:rPr>
+          <w:rFonts w:ascii="Courier New" w:hAnsi="Courier New" w:cs="Courier New"/>
+          <w:lang w:val="nl-NL"/>
+        </w:rPr>
+        <w:t xml:space="preserve"> </w:t>
+      </w:r>
+      <w:r>
+        <w:rPr>
+          <w:rFonts w:ascii="Courier New" w:hAnsi="Courier New" w:cs="Courier New"/>
+          <w:lang w:val="nl-NL"/>
+        </w:rPr>
+        <w:t>Z</w:t>
+      </w:r>
+      <w:r>
+        <w:rPr>
+          <w:rFonts w:ascii="Courier New" w:hAnsi="Courier New" w:cs="Courier New"/>
+          <w:lang w:val="nl-NL"/>
+        </w:rPr>
+        <w:t xml:space="preserve">ij stelt bepaalde grondbeginselen van het </w:t>
+      </w:r>
+      <w:r>
+        <w:rPr>
+          <w:rFonts w:ascii="Courier New" w:hAnsi="Courier New" w:cs="Courier New"/>
+          <w:lang w:val="nl-NL"/>
+        </w:rPr>
+        <w:t>hele</w:t>
+      </w:r>
+      <w:r>
+        <w:rPr>
+          <w:rFonts w:ascii="Courier New" w:hAnsi="Courier New" w:cs="Courier New"/>
+          <w:lang w:val="nl-NL"/>
+        </w:rPr>
+        <w:t xml:space="preserve"> politieke systeem</w:t>
       </w:r>
       <w:r>
         <w:rPr>
@@ -1506,7 +1756,15 @@
           <w:rFonts w:ascii="Courier New" w:hAnsi="Courier New" w:cs="Courier New"/>
           <w:lang w:val="nl-NL"/>
         </w:rPr>
-        <w:t xml:space="preserve">. Bekende vertegenwoordigers zijn Patrick </w:t>
+        <w:t xml:space="preserve">. Bekende vertegenwoordigers zijn </w:t>
+      </w:r>
+      <w:r>
+        <w:rPr>
+          <w:rFonts w:ascii="Courier New" w:hAnsi="Courier New" w:cs="Courier New"/>
+          <w:lang w:val="nl-NL"/>
+        </w:rPr>
+        <w:lastRenderedPageBreak/>
+        <w:t xml:space="preserve">Patrick </w:t>
       </w:r>
       <w:proofErr w:type="spellStart"/>
       <w:r>
@@ -1610,15 +1868,7 @@
           <w:rFonts w:ascii="Courier New" w:hAnsi="Courier New" w:cs="Courier New"/>
           <w:lang w:val="nl-NL"/>
         </w:rPr>
-        <w:t xml:space="preserve">Volgens hen heeft het liberalisme geleid tot individualisme, morele ontbinding en het uiteenvallen van gemeenschappen. De staat zou daarom niet neutraal moeten blijven tegenover </w:t>
-      </w:r>
-      <w:r>
-        <w:rPr>
-          <w:rFonts w:ascii="Courier New" w:hAnsi="Courier New" w:cs="Courier New"/>
-          <w:lang w:val="nl-NL"/>
-        </w:rPr>
-        <w:lastRenderedPageBreak/>
-        <w:t>verschillende opvattingen van het goede leven. Politieke macht moet juist worden ingezet om een gemeenschappelijk moreel doel te bevorderen.</w:t>
+        <w:t>Volgens hen heeft het liberalisme geleid tot individualisme, morele ontbinding en het uiteenvallen van gemeenschappen. De staat zou daarom niet neutraal moeten blijven tegenover verschillende opvattingen van het goede leven. Politieke macht moet juist worden ingezet om een gemeenschappelijk moreel doel te bevorderen.</w:t>
       </w:r>
       <w:r>
         <w:rPr>
@@ -1789,6 +2039,7 @@
         <w:t xml:space="preserve"> </w:t>
       </w:r>
       <w:proofErr w:type="spellStart"/>
+      <w:proofErr w:type="gramStart"/>
       <w:r>
         <w:rPr>
           <w:rFonts w:ascii="Courier New" w:hAnsi="Courier New" w:cs="Courier New"/>
@@ -1802,7 +2053,29 @@
           <w:rFonts w:ascii="Courier New" w:hAnsi="Courier New" w:cs="Courier New"/>
           <w:lang w:val="nl-NL"/>
         </w:rPr>
-        <w:t xml:space="preserve"> en Peter Thiel</w:t>
+        <w:t xml:space="preserve">, </w:t>
+      </w:r>
+      <w:r>
+        <w:rPr>
+          <w:rFonts w:ascii="Courier New" w:hAnsi="Courier New" w:cs="Courier New"/>
+          <w:lang w:val="nl-NL"/>
+        </w:rPr>
+        <w:t xml:space="preserve"> Peter</w:t>
+      </w:r>
+      <w:proofErr w:type="gramEnd"/>
+      <w:r>
+        <w:rPr>
+          <w:rFonts w:ascii="Courier New" w:hAnsi="Courier New" w:cs="Courier New"/>
+          <w:lang w:val="nl-NL"/>
+        </w:rPr>
+        <w:t xml:space="preserve"> Thiel</w:t>
+      </w:r>
+      <w:r>
+        <w:rPr>
+          <w:rFonts w:ascii="Courier New" w:hAnsi="Courier New" w:cs="Courier New"/>
+          <w:lang w:val="nl-NL"/>
+        </w:rPr>
+        <w:t>, Victor Orbán en de Heritage Foundation</w:t>
       </w:r>
       <w:r>
         <w:rPr>
@@ -2027,7 +2300,7 @@
           <w:rFonts w:ascii="Courier New" w:hAnsi="Courier New" w:cs="Courier New"/>
           <w:lang w:val="nl-NL"/>
         </w:rPr>
-        <w:t>Bronze</w:t>
+        <w:t>Curtis</w:t>
       </w:r>
       <w:proofErr w:type="spellEnd"/>
       <w:r>
@@ -2035,7 +2308,7 @@
           <w:rFonts w:ascii="Courier New" w:hAnsi="Courier New" w:cs="Courier New"/>
           <w:lang w:val="nl-NL"/>
         </w:rPr>
-        <w:t xml:space="preserve"> Age </w:t>
+        <w:t xml:space="preserve"> </w:t>
       </w:r>
       <w:proofErr w:type="spellStart"/>
       <w:r>
@@ -2043,7 +2316,7 @@
           <w:rFonts w:ascii="Courier New" w:hAnsi="Courier New" w:cs="Courier New"/>
           <w:lang w:val="nl-NL"/>
         </w:rPr>
-        <w:t>Pervert</w:t>
+        <w:t>Yarvin</w:t>
       </w:r>
       <w:proofErr w:type="spellEnd"/>
       <w:r>
@@ -2059,7 +2332,7 @@
           <w:rFonts w:ascii="Courier New" w:hAnsi="Courier New" w:cs="Courier New"/>
           <w:lang w:val="nl-NL"/>
         </w:rPr>
-        <w:t>Curtis</w:t>
+        <w:t>Costin</w:t>
       </w:r>
       <w:proofErr w:type="spellEnd"/>
       <w:r>
@@ -2075,7 +2348,7 @@
           <w:rFonts w:ascii="Courier New" w:hAnsi="Courier New" w:cs="Courier New"/>
           <w:lang w:val="nl-NL"/>
         </w:rPr>
-        <w:t>Yarvin</w:t>
+        <w:t>Alamariu</w:t>
       </w:r>
       <w:proofErr w:type="spellEnd"/>
       <w:r>
@@ -2083,7 +2356,7 @@
           <w:rFonts w:ascii="Courier New" w:hAnsi="Courier New" w:cs="Courier New"/>
           <w:lang w:val="nl-NL"/>
         </w:rPr>
-        <w:t xml:space="preserve">, </w:t>
+        <w:t xml:space="preserve">, Charles </w:t>
       </w:r>
       <w:proofErr w:type="spellStart"/>
       <w:r>
@@ -2091,7 +2364,7 @@
           <w:rFonts w:ascii="Courier New" w:hAnsi="Courier New" w:cs="Courier New"/>
           <w:lang w:val="nl-NL"/>
         </w:rPr>
-        <w:t>Raw</w:t>
+        <w:t>Corinish</w:t>
       </w:r>
       <w:proofErr w:type="spellEnd"/>
       <w:r>
@@ -2099,47 +2372,31 @@
           <w:rFonts w:ascii="Courier New" w:hAnsi="Courier New" w:cs="Courier New"/>
           <w:lang w:val="nl-NL"/>
         </w:rPr>
+        <w:t xml:space="preserve"> en Stephen </w:t>
+      </w:r>
+      <w:proofErr w:type="spellStart"/>
+      <w:r>
+        <w:rPr>
+          <w:rFonts w:ascii="Courier New" w:hAnsi="Courier New" w:cs="Courier New"/>
+          <w:lang w:val="nl-NL"/>
+        </w:rPr>
+        <w:t>Wolfe</w:t>
+      </w:r>
+      <w:proofErr w:type="spellEnd"/>
+      <w:r>
+        <w:rPr>
+          <w:rFonts w:ascii="Courier New" w:hAnsi="Courier New" w:cs="Courier New"/>
+          <w:lang w:val="nl-NL"/>
+        </w:rPr>
+        <w:t>. Deze groep is minder ideologisch samenhangend dan de andere drie. De verschillende denkers combineren elementen van nationalisme, postliberalisme en radicaal rechts met eigen ideeën.</w:t>
+      </w:r>
+      <w:r>
+        <w:rPr>
+          <w:rFonts w:ascii="Courier New" w:hAnsi="Courier New" w:cs="Courier New"/>
+          <w:lang w:val="nl-NL"/>
+        </w:rPr>
         <w:t xml:space="preserve"> </w:t>
       </w:r>
-      <w:proofErr w:type="spellStart"/>
-      <w:r>
-        <w:rPr>
-          <w:rFonts w:ascii="Courier New" w:hAnsi="Courier New" w:cs="Courier New"/>
-          <w:lang w:val="nl-NL"/>
-        </w:rPr>
-        <w:t>Egg</w:t>
-      </w:r>
-      <w:proofErr w:type="spellEnd"/>
-      <w:r>
-        <w:rPr>
-          <w:rFonts w:ascii="Courier New" w:hAnsi="Courier New" w:cs="Courier New"/>
-          <w:lang w:val="nl-NL"/>
-        </w:rPr>
-        <w:t xml:space="preserve"> Nationalist en Stephen </w:t>
-      </w:r>
-      <w:proofErr w:type="spellStart"/>
-      <w:r>
-        <w:rPr>
-          <w:rFonts w:ascii="Courier New" w:hAnsi="Courier New" w:cs="Courier New"/>
-          <w:lang w:val="nl-NL"/>
-        </w:rPr>
-        <w:t>Wolfe</w:t>
-      </w:r>
-      <w:proofErr w:type="spellEnd"/>
-      <w:r>
-        <w:rPr>
-          <w:rFonts w:ascii="Courier New" w:hAnsi="Courier New" w:cs="Courier New"/>
-          <w:lang w:val="nl-NL"/>
-        </w:rPr>
-        <w:t>. Deze groep is minder ideologisch samenhangend dan de andere drie. De verschillende denkers combineren elementen van nationalisme, postliberalisme en radicaal rechts met eigen ideeën.</w:t>
-      </w:r>
-      <w:r>
-        <w:rPr>
-          <w:rFonts w:ascii="Courier New" w:hAnsi="Courier New" w:cs="Courier New"/>
-          <w:lang w:val="nl-NL"/>
-        </w:rPr>
-        <w:t xml:space="preserve"> </w:t>
-      </w:r>
       <w:r>
         <w:rPr>
           <w:rFonts w:ascii="Courier New" w:hAnsi="Courier New" w:cs="Courier New"/>
@@ -2152,7 +2409,15 @@
           <w:rFonts w:ascii="Courier New" w:hAnsi="Courier New" w:cs="Courier New"/>
           <w:lang w:val="nl-NL"/>
         </w:rPr>
-        <w:t xml:space="preserve"> hen vooral onderscheidt, is de radicaliteit van hun retoriek. Geweld, autoritarisme en afwijzing van democratische normen worden hier openlijker besproken. Sommige vertegenwoordigers zijn volgens haar zelfs expliciet over hun affiniteit met fascistische denkbeelden.</w:t>
+        <w:t xml:space="preserve"> hen vooral onderscheidt, is de radicaliteit van hun retoriek. Geweld, autoritarisme en afwijzing van democratische normen worden hier openlijker besproken. Sommige vertegenwoordigers zijn volgens </w:t>
+      </w:r>
+      <w:r>
+        <w:rPr>
+          <w:rFonts w:ascii="Courier New" w:hAnsi="Courier New" w:cs="Courier New"/>
+          <w:lang w:val="nl-NL"/>
+        </w:rPr>
+        <w:lastRenderedPageBreak/>
+        <w:t>haar zelfs expliciet over hun affiniteit met fascistische denkbeelden.</w:t>
       </w:r>
     </w:p>
     <w:p>
@@ -2190,6 +2455,13 @@
           <w:rFonts w:ascii="Courier New" w:hAnsi="Courier New" w:cs="Courier New"/>
           <w:lang w:val="nl-NL"/>
         </w:rPr>
+        <w:t xml:space="preserve">niet </w:t>
+      </w:r>
+      <w:r>
+        <w:rPr>
+          <w:rFonts w:ascii="Courier New" w:hAnsi="Courier New" w:cs="Courier New"/>
+          <w:lang w:val="nl-NL"/>
+        </w:rPr>
         <w:t xml:space="preserve">mag </w:t>
       </w:r>
       <w:r>
@@ -2197,13 +2469,6 @@
           <w:rFonts w:ascii="Courier New" w:hAnsi="Courier New" w:cs="Courier New"/>
           <w:lang w:val="nl-NL"/>
         </w:rPr>
-        <w:t xml:space="preserve">niet </w:t>
-      </w:r>
-      <w:r>
-        <w:rPr>
-          <w:rFonts w:ascii="Courier New" w:hAnsi="Courier New" w:cs="Courier New"/>
-          <w:lang w:val="nl-NL"/>
-        </w:rPr>
         <w:t xml:space="preserve">worden afgedaan als een marginaal verschijnsel. </w:t>
       </w:r>
       <w:r>
@@ -2288,15 +2553,7 @@
           <w:rFonts w:ascii="Courier New" w:hAnsi="Courier New" w:cs="Courier New"/>
           <w:lang w:val="nl-NL"/>
         </w:rPr>
-        <w:t xml:space="preserve">ort en Project 2025. Volgens Field hebben </w:t>
-      </w:r>
-      <w:r>
-        <w:rPr>
-          <w:rFonts w:ascii="Courier New" w:hAnsi="Courier New" w:cs="Courier New"/>
-          <w:lang w:val="nl-NL"/>
-        </w:rPr>
-        <w:lastRenderedPageBreak/>
-        <w:t xml:space="preserve">de betrokken intellectuelen bovendien bijgedragen aan het ideologische en juridische klimaat rondom 6 januari 2021. Hun invloed strekt zich uit van medewerkers op </w:t>
+        <w:t xml:space="preserve">ort en Project 2025. Volgens Field hebben de betrokken intellectuelen bovendien bijgedragen aan het ideologische en juridische klimaat rondom 6 januari 2021. Hun invloed strekt zich uit van medewerkers op </w:t>
       </w:r>
       <w:proofErr w:type="spellStart"/>
       <w:r>
@@ -2328,7 +2585,7 @@
           <w:rFonts w:ascii="Courier New" w:hAnsi="Courier New" w:cs="Courier New"/>
           <w:lang w:val="nl-NL"/>
         </w:rPr>
-        <w:t xml:space="preserve"> en hebben </w:t>
+        <w:t xml:space="preserve"> en </w:t>
       </w:r>
       <w:r>
         <w:rPr>
@@ -2342,6 +2599,20 @@
           <w:rFonts w:ascii="Courier New" w:hAnsi="Courier New" w:cs="Courier New"/>
           <w:lang w:val="nl-NL"/>
         </w:rPr>
+        <w:t>hebben</w:t>
+      </w:r>
+      <w:r>
+        <w:rPr>
+          <w:rFonts w:ascii="Courier New" w:hAnsi="Courier New" w:cs="Courier New"/>
+          <w:lang w:val="nl-NL"/>
+        </w:rPr>
+        <w:t xml:space="preserve"> </w:t>
+      </w:r>
+      <w:r>
+        <w:rPr>
+          <w:rFonts w:ascii="Courier New" w:hAnsi="Courier New" w:cs="Courier New"/>
+          <w:lang w:val="nl-NL"/>
+        </w:rPr>
         <w:t xml:space="preserve">sterke </w:t>
       </w:r>
       <w:r>
@@ -2377,14 +2648,14 @@
           <w:rFonts w:ascii="Courier New" w:hAnsi="Courier New" w:cs="Courier New"/>
           <w:lang w:val="nl-NL"/>
         </w:rPr>
-        <w:t xml:space="preserve">. </w:t>
-      </w:r>
-      <w:r>
-        <w:rPr>
-          <w:rFonts w:ascii="Courier New" w:hAnsi="Courier New" w:cs="Courier New"/>
-          <w:lang w:val="nl-NL"/>
-        </w:rPr>
-        <w:t>Het gebruikt k</w:t>
+        <w:t>, h</w:t>
+      </w:r>
+      <w:r>
+        <w:rPr>
+          <w:rFonts w:ascii="Courier New" w:hAnsi="Courier New" w:cs="Courier New"/>
+          <w:lang w:val="nl-NL"/>
+        </w:rPr>
+        <w:t>et gebruikt k</w:t>
       </w:r>
       <w:r>
         <w:rPr>
@@ -2468,7 +2739,7 @@
           <w:rFonts w:ascii="Courier New" w:hAnsi="Courier New" w:cs="Courier New"/>
           <w:lang w:val="nl-NL"/>
         </w:rPr>
-        <w:t>0</w:t>
+        <w:t>-</w:t>
       </w:r>
       <w:r>
         <w:rPr>
@@ -2503,7 +2774,21 @@
           <w:rFonts w:ascii="Courier New" w:hAnsi="Courier New" w:cs="Courier New"/>
           <w:lang w:val="nl-NL"/>
         </w:rPr>
-        <w:t xml:space="preserve">Ze verdedigen patriottistisch onderwijs, willen bepaalde instituten afbreken en hebben hun eigen kijk op de constituties. </w:t>
+        <w:t>Ze verdedigen patriottistisch onderwijs</w:t>
+      </w:r>
+      <w:r>
+        <w:rPr>
+          <w:rFonts w:ascii="Courier New" w:hAnsi="Courier New" w:cs="Courier New"/>
+          <w:lang w:val="nl-NL"/>
+        </w:rPr>
+        <w:t xml:space="preserve"> (zowel basisopleiding als de universiteit)</w:t>
+      </w:r>
+      <w:r>
+        <w:rPr>
+          <w:rFonts w:ascii="Courier New" w:hAnsi="Courier New" w:cs="Courier New"/>
+          <w:lang w:val="nl-NL"/>
+        </w:rPr>
+        <w:t xml:space="preserve">, willen bepaalde instituten afbreken en hebben hun eigen kijk op de constitutie. </w:t>
       </w:r>
       <w:r>
         <w:rPr>
@@ -2633,21 +2918,163 @@
           <w:rFonts w:ascii="Courier New" w:hAnsi="Courier New" w:cs="Courier New"/>
           <w:lang w:val="nl-NL"/>
         </w:rPr>
-        <w:t xml:space="preserve">Zij wil haar afkeer van MAGA Nieuw Rechts duidelijk maken die zij </w:t>
-      </w:r>
-      <w:r>
-        <w:rPr>
-          <w:rFonts w:ascii="Courier New" w:hAnsi="Courier New" w:cs="Courier New"/>
-          <w:lang w:val="nl-NL"/>
-        </w:rPr>
-        <w:t>als extremistisch, sterk reactionair, instabiel en gevaarlijk</w:t>
-      </w:r>
-      <w:r>
-        <w:rPr>
-          <w:rFonts w:ascii="Courier New" w:hAnsi="Courier New" w:cs="Courier New"/>
-          <w:lang w:val="nl-NL"/>
-        </w:rPr>
-        <w:t xml:space="preserve"> ziet</w:t>
+        <w:t xml:space="preserve">Zij </w:t>
+      </w:r>
+      <w:r>
+        <w:rPr>
+          <w:rFonts w:ascii="Courier New" w:hAnsi="Courier New" w:cs="Courier New"/>
+          <w:lang w:val="nl-NL"/>
+        </w:rPr>
+        <w:t>maakt</w:t>
+      </w:r>
+      <w:r>
+        <w:rPr>
+          <w:rFonts w:ascii="Courier New" w:hAnsi="Courier New" w:cs="Courier New"/>
+          <w:lang w:val="nl-NL"/>
+        </w:rPr>
+        <w:t xml:space="preserve"> haar afkeer van MAGA Nieuw Rechts duidelijk</w:t>
+      </w:r>
+      <w:r>
+        <w:rPr>
+          <w:rFonts w:ascii="Courier New" w:hAnsi="Courier New" w:cs="Courier New"/>
+          <w:lang w:val="nl-NL"/>
+        </w:rPr>
+        <w:t>. D</w:t>
+      </w:r>
+      <w:r>
+        <w:rPr>
+          <w:rFonts w:ascii="Courier New" w:hAnsi="Courier New" w:cs="Courier New"/>
+          <w:lang w:val="nl-NL"/>
+        </w:rPr>
+        <w:t xml:space="preserve">ie </w:t>
+      </w:r>
+      <w:r>
+        <w:rPr>
+          <w:rFonts w:ascii="Courier New" w:hAnsi="Courier New" w:cs="Courier New"/>
+          <w:lang w:val="nl-NL"/>
+        </w:rPr>
+        <w:t>is volgens haar</w:t>
+      </w:r>
+      <w:r>
+        <w:rPr>
+          <w:rFonts w:ascii="Courier New" w:hAnsi="Courier New" w:cs="Courier New"/>
+          <w:lang w:val="nl-NL"/>
+        </w:rPr>
+        <w:t xml:space="preserve"> extremistisch, sterk reactionair, instabiel en gevaarlijk.</w:t>
+      </w:r>
+      <w:r>
+        <w:rPr>
+          <w:rFonts w:ascii="Courier New" w:hAnsi="Courier New" w:cs="Courier New"/>
+          <w:lang w:val="nl-NL"/>
+        </w:rPr>
+        <w:t xml:space="preserve"> </w:t>
+      </w:r>
+      <w:r>
+        <w:rPr>
+          <w:rFonts w:ascii="Courier New" w:hAnsi="Courier New" w:cs="Courier New"/>
+          <w:lang w:val="nl-NL"/>
+        </w:rPr>
+        <w:t>Zij steekt haar mening niet onder stoelen en banken.</w:t>
+      </w:r>
+      <w:r>
+        <w:rPr>
+          <w:rFonts w:ascii="Courier New" w:hAnsi="Courier New" w:cs="Courier New"/>
+          <w:lang w:val="nl-NL"/>
+        </w:rPr>
+        <w:t xml:space="preserve"> </w:t>
+      </w:r>
+      <w:r>
+        <w:rPr>
+          <w:rFonts w:ascii="Courier New" w:hAnsi="Courier New" w:cs="Courier New"/>
+          <w:lang w:val="nl-NL"/>
+        </w:rPr>
+        <w:t xml:space="preserve">Maar </w:t>
+      </w:r>
+      <w:r>
+        <w:rPr>
+          <w:rFonts w:ascii="Courier New" w:hAnsi="Courier New" w:cs="Courier New"/>
+          <w:lang w:val="nl-NL"/>
+        </w:rPr>
+        <w:t xml:space="preserve">zij </w:t>
+      </w:r>
+      <w:r>
+        <w:rPr>
+          <w:rFonts w:ascii="Courier New" w:hAnsi="Courier New" w:cs="Courier New"/>
+          <w:lang w:val="nl-NL"/>
+        </w:rPr>
+        <w:t xml:space="preserve">verzet </w:t>
+      </w:r>
+      <w:r>
+        <w:rPr>
+          <w:rFonts w:ascii="Courier New" w:hAnsi="Courier New" w:cs="Courier New"/>
+          <w:lang w:val="nl-NL"/>
+        </w:rPr>
+        <w:t xml:space="preserve">zich </w:t>
+      </w:r>
+      <w:r>
+        <w:rPr>
+          <w:rFonts w:ascii="Courier New" w:hAnsi="Courier New" w:cs="Courier New"/>
+          <w:lang w:val="nl-NL"/>
+        </w:rPr>
+        <w:t xml:space="preserve">ook </w:t>
+      </w:r>
+      <w:r>
+        <w:rPr>
+          <w:rFonts w:ascii="Courier New" w:hAnsi="Courier New" w:cs="Courier New"/>
+          <w:lang w:val="nl-NL"/>
+        </w:rPr>
+        <w:t xml:space="preserve">tegen liberalen die MAGA </w:t>
+      </w:r>
+      <w:r>
+        <w:rPr>
+          <w:rFonts w:ascii="Courier New" w:hAnsi="Courier New" w:cs="Courier New"/>
+          <w:lang w:val="nl-NL"/>
+        </w:rPr>
+        <w:t>zien als</w:t>
+      </w:r>
+      <w:r>
+        <w:rPr>
+          <w:rFonts w:ascii="Courier New" w:hAnsi="Courier New" w:cs="Courier New"/>
+          <w:lang w:val="nl-NL"/>
+        </w:rPr>
+        <w:t xml:space="preserve"> dom, intellectueel leeg of uitsluitend het product van </w:t>
+      </w:r>
+      <w:proofErr w:type="spellStart"/>
+      <w:r>
+        <w:rPr>
+          <w:rFonts w:ascii="Courier New" w:hAnsi="Courier New" w:cs="Courier New"/>
+          <w:lang w:val="nl-NL"/>
+        </w:rPr>
+        <w:t>Trumps</w:t>
+      </w:r>
+      <w:proofErr w:type="spellEnd"/>
+      <w:r>
+        <w:rPr>
+          <w:rFonts w:ascii="Courier New" w:hAnsi="Courier New" w:cs="Courier New"/>
+          <w:lang w:val="nl-NL"/>
+        </w:rPr>
+        <w:t xml:space="preserve"> persoonlijkheid</w:t>
+      </w:r>
+      <w:r>
+        <w:rPr>
+          <w:rFonts w:ascii="Courier New" w:hAnsi="Courier New" w:cs="Courier New"/>
+          <w:lang w:val="nl-NL"/>
+        </w:rPr>
+        <w:t xml:space="preserve"> en mensen die deze ideeën niet serieus </w:t>
+      </w:r>
+      <w:r>
+        <w:rPr>
+          <w:rFonts w:ascii="Courier New" w:hAnsi="Courier New" w:cs="Courier New"/>
+          <w:lang w:val="nl-NL"/>
+        </w:rPr>
+        <w:t xml:space="preserve">genoeg </w:t>
+      </w:r>
+      <w:r>
+        <w:rPr>
+          <w:rFonts w:ascii="Courier New" w:hAnsi="Courier New" w:cs="Courier New"/>
+          <w:lang w:val="nl-NL"/>
+        </w:rPr>
+        <w:t>nemen</w:t>
       </w:r>
       <w:r>
         <w:rPr>
@@ -2668,7 +3095,7 @@
           <w:rFonts w:ascii="Courier New" w:hAnsi="Courier New" w:cs="Courier New"/>
           <w:lang w:val="nl-NL"/>
         </w:rPr>
-        <w:t>Zij steekt haar mening niet onder stoelen en banken.</w:t>
+        <w:t>Want dat</w:t>
       </w:r>
       <w:r>
         <w:rPr>
@@ -2682,56 +3109,70 @@
           <w:rFonts w:ascii="Courier New" w:hAnsi="Courier New" w:cs="Courier New"/>
           <w:lang w:val="nl-NL"/>
         </w:rPr>
-        <w:t xml:space="preserve">Maar </w:t>
-      </w:r>
-      <w:r>
-        <w:rPr>
-          <w:rFonts w:ascii="Courier New" w:hAnsi="Courier New" w:cs="Courier New"/>
-          <w:lang w:val="nl-NL"/>
-        </w:rPr>
-        <w:t xml:space="preserve">zij </w:t>
-      </w:r>
-      <w:r>
-        <w:rPr>
-          <w:rFonts w:ascii="Courier New" w:hAnsi="Courier New" w:cs="Courier New"/>
-          <w:lang w:val="nl-NL"/>
-        </w:rPr>
-        <w:t xml:space="preserve">verzet </w:t>
-      </w:r>
-      <w:r>
-        <w:rPr>
-          <w:rFonts w:ascii="Courier New" w:hAnsi="Courier New" w:cs="Courier New"/>
-          <w:lang w:val="nl-NL"/>
-        </w:rPr>
-        <w:t xml:space="preserve">zich </w:t>
-      </w:r>
-      <w:r>
-        <w:rPr>
-          <w:rFonts w:ascii="Courier New" w:hAnsi="Courier New" w:cs="Courier New"/>
-          <w:lang w:val="nl-NL"/>
-        </w:rPr>
-        <w:t xml:space="preserve">ook </w:t>
-      </w:r>
-      <w:r>
-        <w:rPr>
-          <w:rFonts w:ascii="Courier New" w:hAnsi="Courier New" w:cs="Courier New"/>
-          <w:lang w:val="nl-NL"/>
-        </w:rPr>
-        <w:t xml:space="preserve">tegen liberalen die MAGA </w:t>
-      </w:r>
-      <w:r>
-        <w:rPr>
-          <w:rFonts w:ascii="Courier New" w:hAnsi="Courier New" w:cs="Courier New"/>
-          <w:lang w:val="nl-NL"/>
-        </w:rPr>
-        <w:t>zien als</w:t>
-      </w:r>
-      <w:r>
-        <w:rPr>
-          <w:rFonts w:ascii="Courier New" w:hAnsi="Courier New" w:cs="Courier New"/>
-          <w:lang w:val="nl-NL"/>
-        </w:rPr>
-        <w:t xml:space="preserve"> als dom, intellectueel leeg of uitsluitend het product van </w:t>
+        <w:t>zou</w:t>
+      </w:r>
+      <w:r>
+        <w:rPr>
+          <w:rFonts w:ascii="Courier New" w:hAnsi="Courier New" w:cs="Courier New"/>
+          <w:lang w:val="nl-NL"/>
+        </w:rPr>
+        <w:t xml:space="preserve"> volgens haar juist </w:t>
+      </w:r>
+      <w:r>
+        <w:rPr>
+          <w:rFonts w:ascii="Courier New" w:hAnsi="Courier New" w:cs="Courier New"/>
+          <w:lang w:val="nl-NL"/>
+        </w:rPr>
+        <w:t xml:space="preserve">wel eens </w:t>
+      </w:r>
+      <w:r>
+        <w:rPr>
+          <w:rFonts w:ascii="Courier New" w:hAnsi="Courier New" w:cs="Courier New"/>
+          <w:lang w:val="nl-NL"/>
+        </w:rPr>
+        <w:t xml:space="preserve">een </w:t>
+      </w:r>
+      <w:r>
+        <w:rPr>
+          <w:rFonts w:ascii="Courier New" w:hAnsi="Courier New" w:cs="Courier New"/>
+          <w:lang w:val="nl-NL"/>
+        </w:rPr>
+        <w:t xml:space="preserve">hele </w:t>
+      </w:r>
+      <w:r>
+        <w:rPr>
+          <w:rFonts w:ascii="Courier New" w:hAnsi="Courier New" w:cs="Courier New"/>
+          <w:lang w:val="nl-NL"/>
+        </w:rPr>
+        <w:t>ernstige vergissing</w:t>
+      </w:r>
+      <w:r>
+        <w:rPr>
+          <w:rFonts w:ascii="Courier New" w:hAnsi="Courier New" w:cs="Courier New"/>
+          <w:lang w:val="nl-NL"/>
+        </w:rPr>
+        <w:t xml:space="preserve"> </w:t>
+      </w:r>
+      <w:r>
+        <w:rPr>
+          <w:rFonts w:ascii="Courier New" w:hAnsi="Courier New" w:cs="Courier New"/>
+          <w:lang w:val="nl-NL"/>
+        </w:rPr>
+        <w:t xml:space="preserve">kunnen </w:t>
+      </w:r>
+      <w:r>
+        <w:rPr>
+          <w:rFonts w:ascii="Courier New" w:hAnsi="Courier New" w:cs="Courier New"/>
+          <w:lang w:val="nl-NL"/>
+        </w:rPr>
+        <w:t>zijn</w:t>
+      </w:r>
+      <w:r>
+        <w:rPr>
+          <w:rFonts w:ascii="Courier New" w:hAnsi="Courier New" w:cs="Courier New"/>
+          <w:lang w:val="nl-NL"/>
+        </w:rPr>
+        <w:t xml:space="preserve">. </w:t>
       </w:r>
       <w:proofErr w:type="spellStart"/>
       <w:r>
@@ -2739,7 +3180,7 @@
           <w:rFonts w:ascii="Courier New" w:hAnsi="Courier New" w:cs="Courier New"/>
           <w:lang w:val="nl-NL"/>
         </w:rPr>
-        <w:t>Trumps</w:t>
+        <w:t>Trump</w:t>
       </w:r>
       <w:proofErr w:type="spellEnd"/>
       <w:r>
@@ -2747,27 +3188,6 @@
           <w:rFonts w:ascii="Courier New" w:hAnsi="Courier New" w:cs="Courier New"/>
           <w:lang w:val="nl-NL"/>
         </w:rPr>
-        <w:t xml:space="preserve"> persoonlijkheid</w:t>
-      </w:r>
-      <w:r>
-        <w:rPr>
-          <w:rFonts w:ascii="Courier New" w:hAnsi="Courier New" w:cs="Courier New"/>
-          <w:lang w:val="nl-NL"/>
-        </w:rPr>
-        <w:t xml:space="preserve"> en mensen die deze ideeën niet serieus nemen</w:t>
-      </w:r>
-      <w:r>
-        <w:rPr>
-          <w:rFonts w:ascii="Courier New" w:hAnsi="Courier New" w:cs="Courier New"/>
-          <w:lang w:val="nl-NL"/>
-        </w:rPr>
-        <w:t>.</w:t>
-      </w:r>
-      <w:r>
-        <w:rPr>
-          <w:rFonts w:ascii="Courier New" w:hAnsi="Courier New" w:cs="Courier New"/>
-          <w:lang w:val="nl-NL"/>
-        </w:rPr>
         <w:t xml:space="preserve"> </w:t>
       </w:r>
       <w:r>
@@ -2775,65 +3195,29 @@
           <w:rFonts w:ascii="Courier New" w:hAnsi="Courier New" w:cs="Courier New"/>
           <w:lang w:val="nl-NL"/>
         </w:rPr>
-        <w:t xml:space="preserve">Dat </w:t>
-      </w:r>
-      <w:r>
-        <w:rPr>
-          <w:rFonts w:ascii="Courier New" w:hAnsi="Courier New" w:cs="Courier New"/>
-          <w:lang w:val="nl-NL"/>
-        </w:rPr>
-        <w:t>zou</w:t>
-      </w:r>
-      <w:r>
-        <w:rPr>
-          <w:rFonts w:ascii="Courier New" w:hAnsi="Courier New" w:cs="Courier New"/>
-          <w:lang w:val="nl-NL"/>
-        </w:rPr>
-        <w:t xml:space="preserve"> volgens haar juist een ernstige vergissing</w:t>
-      </w:r>
-      <w:r>
-        <w:rPr>
-          <w:rFonts w:ascii="Courier New" w:hAnsi="Courier New" w:cs="Courier New"/>
-          <w:lang w:val="nl-NL"/>
-        </w:rPr>
-        <w:t xml:space="preserve"> zijn</w:t>
-      </w:r>
-      <w:r>
-        <w:rPr>
-          <w:rFonts w:ascii="Courier New" w:hAnsi="Courier New" w:cs="Courier New"/>
-          <w:lang w:val="nl-NL"/>
-        </w:rPr>
-        <w:t xml:space="preserve">. </w:t>
-      </w:r>
-      <w:proofErr w:type="spellStart"/>
-      <w:r>
-        <w:rPr>
-          <w:rFonts w:ascii="Courier New" w:hAnsi="Courier New" w:cs="Courier New"/>
-          <w:lang w:val="nl-NL"/>
-        </w:rPr>
-        <w:t>Trump</w:t>
-      </w:r>
-      <w:proofErr w:type="spellEnd"/>
-      <w:r>
-        <w:rPr>
-          <w:rFonts w:ascii="Courier New" w:hAnsi="Courier New" w:cs="Courier New"/>
-          <w:lang w:val="nl-NL"/>
-        </w:rPr>
-        <w:t xml:space="preserve"> </w:t>
-      </w:r>
-      <w:r>
-        <w:rPr>
-          <w:rFonts w:ascii="Courier New" w:hAnsi="Courier New" w:cs="Courier New"/>
-          <w:lang w:val="nl-NL"/>
-        </w:rPr>
-        <w:t>mag dan wel totaal geen intellectuele interesse hebben of</w:t>
-      </w:r>
-      <w:r>
-        <w:rPr>
-          <w:rFonts w:ascii="Courier New" w:hAnsi="Courier New" w:cs="Courier New"/>
-          <w:lang w:val="nl-NL"/>
-        </w:rPr>
-        <w:t xml:space="preserve"> zelf geen systematische politieke filosofie bezitten</w:t>
+        <w:t xml:space="preserve">mag dan wel totaal geen intellectuele interesse </w:t>
+      </w:r>
+      <w:r>
+        <w:rPr>
+          <w:rFonts w:ascii="Courier New" w:hAnsi="Courier New" w:cs="Courier New"/>
+          <w:lang w:val="nl-NL"/>
+        </w:rPr>
+        <w:lastRenderedPageBreak/>
+        <w:t xml:space="preserve">hebben </w:t>
+      </w:r>
+      <w:r>
+        <w:rPr>
+          <w:rFonts w:ascii="Courier New" w:hAnsi="Courier New" w:cs="Courier New"/>
+          <w:lang w:val="nl-NL"/>
+        </w:rPr>
+        <w:t>en al helemaal</w:t>
+      </w:r>
+      <w:r>
+        <w:rPr>
+          <w:rFonts w:ascii="Courier New" w:hAnsi="Courier New" w:cs="Courier New"/>
+          <w:lang w:val="nl-NL"/>
+        </w:rPr>
+        <w:t xml:space="preserve"> geen systematische politieke filosofie bezitten</w:t>
       </w:r>
       <w:r>
         <w:rPr>
@@ -2927,7 +3311,21 @@
           <w:rFonts w:ascii="Courier New" w:hAnsi="Courier New" w:cs="Courier New"/>
           <w:lang w:val="nl-NL"/>
         </w:rPr>
-        <w:t xml:space="preserve"> zichtbaar</w:t>
+        <w:t xml:space="preserve"> </w:t>
+      </w:r>
+      <w:r>
+        <w:rPr>
+          <w:rFonts w:ascii="Courier New" w:hAnsi="Courier New" w:cs="Courier New"/>
+          <w:lang w:val="nl-NL"/>
+        </w:rPr>
+        <w:t xml:space="preserve">voor een breder publiek </w:t>
+      </w:r>
+      <w:r>
+        <w:rPr>
+          <w:rFonts w:ascii="Courier New" w:hAnsi="Courier New" w:cs="Courier New"/>
+          <w:lang w:val="nl-NL"/>
+        </w:rPr>
+        <w:t>zichtbaar</w:t>
       </w:r>
       <w:r>
         <w:rPr>
@@ -3004,7 +3402,21 @@
           <w:rFonts w:ascii="Courier New" w:hAnsi="Courier New" w:cs="Courier New"/>
           <w:lang w:val="nl-NL"/>
         </w:rPr>
-        <w:t xml:space="preserve">(en misschien ook wel van Europa) </w:t>
+        <w:t xml:space="preserve">(en </w:t>
+      </w:r>
+      <w:r>
+        <w:rPr>
+          <w:rFonts w:ascii="Courier New" w:hAnsi="Courier New" w:cs="Courier New"/>
+          <w:lang w:val="nl-NL"/>
+        </w:rPr>
+        <w:t>allicht elders in de wereld, in ieder geval Europa</w:t>
+      </w:r>
+      <w:r>
+        <w:rPr>
+          <w:rFonts w:ascii="Courier New" w:hAnsi="Courier New" w:cs="Courier New"/>
+          <w:lang w:val="nl-NL"/>
+        </w:rPr>
+        <w:t xml:space="preserve">) </w:t>
       </w:r>
       <w:r>
         <w:rPr>
@@ -3018,9 +3430,22 @@
           <w:rFonts w:ascii="Courier New" w:hAnsi="Courier New" w:cs="Courier New"/>
           <w:lang w:val="nl-NL"/>
         </w:rPr>
-        <w:lastRenderedPageBreak/>
+        <w:t xml:space="preserve">de </w:t>
+      </w:r>
+      <w:r>
+        <w:rPr>
+          <w:rFonts w:ascii="Courier New" w:hAnsi="Courier New" w:cs="Courier New"/>
+          <w:lang w:val="nl-NL"/>
+        </w:rPr>
         <w:t xml:space="preserve">verkiezingen en naar </w:t>
       </w:r>
+      <w:r>
+        <w:rPr>
+          <w:rFonts w:ascii="Courier New" w:hAnsi="Courier New" w:cs="Courier New"/>
+          <w:lang w:val="nl-NL"/>
+        </w:rPr>
+        <w:t xml:space="preserve">alles wat </w:t>
+      </w:r>
       <w:proofErr w:type="spellStart"/>
       <w:r>
         <w:rPr>
@@ -3035,7 +3460,28 @@
           <w:rFonts w:ascii="Courier New" w:hAnsi="Courier New" w:cs="Courier New"/>
           <w:lang w:val="nl-NL"/>
         </w:rPr>
-        <w:t xml:space="preserve"> kijken, maar ook naar de ideeën en intellectuelen die het </w:t>
+        <w:t xml:space="preserve"> doet</w:t>
+      </w:r>
+      <w:r>
+        <w:rPr>
+          <w:rFonts w:ascii="Courier New" w:hAnsi="Courier New" w:cs="Courier New"/>
+          <w:lang w:val="nl-NL"/>
+        </w:rPr>
+        <w:t xml:space="preserve"> kijken</w:t>
+      </w:r>
+      <w:r>
+        <w:rPr>
+          <w:rFonts w:ascii="Courier New" w:hAnsi="Courier New" w:cs="Courier New"/>
+          <w:lang w:val="nl-NL"/>
+        </w:rPr>
+        <w:t xml:space="preserve"> en luisteren</w:t>
+      </w:r>
+      <w:r>
+        <w:rPr>
+          <w:rFonts w:ascii="Courier New" w:hAnsi="Courier New" w:cs="Courier New"/>
+          <w:lang w:val="nl-NL"/>
+        </w:rPr>
+        <w:t xml:space="preserve">, maar ook naar de ideeën en intellectuelen die het </w:t>
       </w:r>
       <w:proofErr w:type="spellStart"/>
       <w:r>
@@ -3091,7 +3537,161 @@
           <w:rFonts w:ascii="Courier New" w:hAnsi="Courier New" w:cs="Courier New"/>
           <w:lang w:val="nl-NL"/>
         </w:rPr>
-        <w:t xml:space="preserve">gegarandeerd hebben beschouwd en beperkt ons begrip van de wereld eigenlijk was, schrijft Field ergens in haar boek. Natuurlijk moeten we met protesten, acties en verkiezingen op allerlei niveaus onze mening laten horen en op langere termijn moeten nadenken over wat we doen, hoe we met elkaar praten, omgaan en in deze wereld handelen. En allicht waren de liberalen intolerant tegenover andere meningen. Uiteindelijk is er van deze Nieuw Rechts-beweging ook te leren. </w:t>
+        <w:t xml:space="preserve">gegarandeerd hebben beschouwd en </w:t>
+      </w:r>
+      <w:r>
+        <w:rPr>
+          <w:rFonts w:ascii="Courier New" w:hAnsi="Courier New" w:cs="Courier New"/>
+          <w:lang w:val="nl-NL"/>
+        </w:rPr>
+        <w:t xml:space="preserve">laat zien hoe </w:t>
+      </w:r>
+      <w:r>
+        <w:rPr>
+          <w:rFonts w:ascii="Courier New" w:hAnsi="Courier New" w:cs="Courier New"/>
+          <w:lang w:val="nl-NL"/>
+        </w:rPr>
+        <w:t xml:space="preserve">beperkt ons begrip van de wereld eigenlijk was, schrijft Field ergens in haar boek. Natuurlijk moeten we met protesten, acties en verkiezingen op allerlei niveaus onze </w:t>
+      </w:r>
+      <w:r>
+        <w:rPr>
+          <w:rFonts w:ascii="Courier New" w:hAnsi="Courier New" w:cs="Courier New"/>
+          <w:lang w:val="nl-NL"/>
+        </w:rPr>
+        <w:t>stem</w:t>
+      </w:r>
+      <w:r>
+        <w:rPr>
+          <w:rFonts w:ascii="Courier New" w:hAnsi="Courier New" w:cs="Courier New"/>
+          <w:lang w:val="nl-NL"/>
+        </w:rPr>
+        <w:t xml:space="preserve"> laten horen en </w:t>
+      </w:r>
+      <w:r>
+        <w:rPr>
+          <w:rFonts w:ascii="Courier New" w:hAnsi="Courier New" w:cs="Courier New"/>
+          <w:lang w:val="nl-NL"/>
+        </w:rPr>
+        <w:t>voor de</w:t>
+      </w:r>
+      <w:r>
+        <w:rPr>
+          <w:rFonts w:ascii="Courier New" w:hAnsi="Courier New" w:cs="Courier New"/>
+          <w:lang w:val="nl-NL"/>
+        </w:rPr>
+        <w:t xml:space="preserve"> langere termijn </w:t>
+      </w:r>
+      <w:r>
+        <w:rPr>
+          <w:rFonts w:ascii="Courier New" w:hAnsi="Courier New" w:cs="Courier New"/>
+          <w:lang w:val="nl-NL"/>
+        </w:rPr>
+        <w:t xml:space="preserve">zullen we goed </w:t>
+      </w:r>
+      <w:r>
+        <w:rPr>
+          <w:rFonts w:ascii="Courier New" w:hAnsi="Courier New" w:cs="Courier New"/>
+          <w:lang w:val="nl-NL"/>
+        </w:rPr>
+        <w:t xml:space="preserve">moeten nadenken over wat we doen, hoe we met elkaar praten, omgaan en in deze wereld handelen. </w:t>
+      </w:r>
+      <w:r>
+        <w:rPr>
+          <w:rFonts w:ascii="Courier New" w:hAnsi="Courier New" w:cs="Courier New"/>
+          <w:lang w:val="nl-NL"/>
+        </w:rPr>
+        <w:t>Wat ze toegeeft is dat liberalen</w:t>
+      </w:r>
+      <w:r>
+        <w:rPr>
+          <w:rFonts w:ascii="Courier New" w:hAnsi="Courier New" w:cs="Courier New"/>
+          <w:lang w:val="nl-NL"/>
+        </w:rPr>
+        <w:t xml:space="preserve"> </w:t>
+      </w:r>
+      <w:r>
+        <w:rPr>
+          <w:rFonts w:ascii="Courier New" w:hAnsi="Courier New" w:cs="Courier New"/>
+          <w:lang w:val="nl-NL"/>
+        </w:rPr>
+        <w:t>zich veel te</w:t>
+      </w:r>
+      <w:r>
+        <w:rPr>
+          <w:rFonts w:ascii="Courier New" w:hAnsi="Courier New" w:cs="Courier New"/>
+          <w:lang w:val="nl-NL"/>
+        </w:rPr>
+        <w:t xml:space="preserve"> intolerant </w:t>
+      </w:r>
+      <w:r>
+        <w:rPr>
+          <w:rFonts w:ascii="Courier New" w:hAnsi="Courier New" w:cs="Courier New"/>
+          <w:lang w:val="nl-NL"/>
+        </w:rPr>
+        <w:t xml:space="preserve">hebben opgesteld </w:t>
+      </w:r>
+      <w:r>
+        <w:rPr>
+          <w:rFonts w:ascii="Courier New" w:hAnsi="Courier New" w:cs="Courier New"/>
+          <w:lang w:val="nl-NL"/>
+        </w:rPr>
+        <w:t xml:space="preserve">tegenover andere meningen. </w:t>
+      </w:r>
+      <w:r>
+        <w:rPr>
+          <w:rFonts w:ascii="Courier New" w:hAnsi="Courier New" w:cs="Courier New"/>
+          <w:lang w:val="nl-NL"/>
+        </w:rPr>
+        <w:t>En wat ze ook schrijft is dat er u</w:t>
+      </w:r>
+      <w:r>
+        <w:rPr>
+          <w:rFonts w:ascii="Courier New" w:hAnsi="Courier New" w:cs="Courier New"/>
+          <w:lang w:val="nl-NL"/>
+        </w:rPr>
+        <w:t xml:space="preserve">iteindelijk </w:t>
+      </w:r>
+      <w:r>
+        <w:rPr>
+          <w:rFonts w:ascii="Courier New" w:hAnsi="Courier New" w:cs="Courier New"/>
+          <w:lang w:val="nl-NL"/>
+        </w:rPr>
+        <w:t xml:space="preserve">ook heel veel van </w:t>
+      </w:r>
+      <w:r>
+        <w:rPr>
+          <w:rFonts w:ascii="Courier New" w:hAnsi="Courier New" w:cs="Courier New"/>
+          <w:lang w:val="nl-NL"/>
+        </w:rPr>
+        <w:t xml:space="preserve">deze Nieuw Rechts-beweging </w:t>
+      </w:r>
+      <w:r>
+        <w:rPr>
+          <w:rFonts w:ascii="Courier New" w:hAnsi="Courier New" w:cs="Courier New"/>
+          <w:lang w:val="nl-NL"/>
+        </w:rPr>
+        <w:t xml:space="preserve">is </w:t>
+      </w:r>
+      <w:r>
+        <w:rPr>
+          <w:rFonts w:ascii="Courier New" w:hAnsi="Courier New" w:cs="Courier New"/>
+          <w:lang w:val="nl-NL"/>
+        </w:rPr>
+        <w:t>te leren</w:t>
+      </w:r>
+      <w:r>
+        <w:rPr>
+          <w:rFonts w:ascii="Courier New" w:hAnsi="Courier New" w:cs="Courier New"/>
+          <w:lang w:val="nl-NL"/>
+        </w:rPr>
+        <w:t>, alleen al omdat je ziet dat ze zoveel kunnen inspireren</w:t>
+      </w:r>
+      <w:r>
+        <w:rPr>
+          <w:rFonts w:ascii="Courier New" w:hAnsi="Courier New" w:cs="Courier New"/>
+          <w:lang w:val="nl-NL"/>
+        </w:rPr>
+        <w:t xml:space="preserve">. </w:t>
       </w:r>
     </w:p>
     <w:p>
@@ -3103,12 +3703,443 @@
           <w:lang w:val="nl-NL"/>
         </w:rPr>
       </w:pPr>
-      <w:r>
-        <w:rPr>
-          <w:rFonts w:ascii="Courier New" w:hAnsi="Courier New" w:cs="Courier New"/>
-          <w:lang w:val="nl-NL"/>
-        </w:rPr>
-        <w:t xml:space="preserve">Maar waar Field het in dit boek, dat te lang en waar de draad door al die namen soms moeilijk vast te houden is, te weinig over heeft is waarom zoveel mensen hierin meegaan. Daar had ik wel wat meer over willen lezen.   </w:t>
+      <w:proofErr w:type="spellStart"/>
+      <w:r>
+        <w:rPr>
+          <w:rFonts w:ascii="Courier New" w:hAnsi="Courier New" w:cs="Courier New"/>
+          <w:i/>
+          <w:iCs/>
+          <w:lang w:val="nl-NL"/>
+        </w:rPr>
+        <w:t>Furious</w:t>
+      </w:r>
+      <w:proofErr w:type="spellEnd"/>
+      <w:r>
+        <w:rPr>
+          <w:rFonts w:ascii="Courier New" w:hAnsi="Courier New" w:cs="Courier New"/>
+          <w:i/>
+          <w:iCs/>
+          <w:lang w:val="nl-NL"/>
+        </w:rPr>
+        <w:t xml:space="preserve"> </w:t>
+      </w:r>
+      <w:proofErr w:type="spellStart"/>
+      <w:r>
+        <w:rPr>
+          <w:rFonts w:ascii="Courier New" w:hAnsi="Courier New" w:cs="Courier New"/>
+          <w:i/>
+          <w:iCs/>
+          <w:lang w:val="nl-NL"/>
+        </w:rPr>
+        <w:t>Minds</w:t>
+      </w:r>
+      <w:proofErr w:type="spellEnd"/>
+      <w:r>
+        <w:rPr>
+          <w:rFonts w:ascii="Courier New" w:hAnsi="Courier New" w:cs="Courier New"/>
+          <w:lang w:val="nl-NL"/>
+        </w:rPr>
+        <w:t xml:space="preserve"> is </w:t>
+      </w:r>
+      <w:r>
+        <w:rPr>
+          <w:rFonts w:ascii="Courier New" w:hAnsi="Courier New" w:cs="Courier New"/>
+          <w:lang w:val="nl-NL"/>
+        </w:rPr>
+        <w:t xml:space="preserve">te lang en </w:t>
+      </w:r>
+      <w:r>
+        <w:rPr>
+          <w:rFonts w:ascii="Courier New" w:hAnsi="Courier New" w:cs="Courier New"/>
+          <w:lang w:val="nl-NL"/>
+        </w:rPr>
+        <w:t xml:space="preserve">wat snijwerk </w:t>
+      </w:r>
+      <w:r>
+        <w:rPr>
+          <w:rFonts w:ascii="Courier New" w:hAnsi="Courier New" w:cs="Courier New"/>
+          <w:lang w:val="nl-NL"/>
+        </w:rPr>
+        <w:t xml:space="preserve">van een redacteur </w:t>
+      </w:r>
+      <w:r>
+        <w:rPr>
+          <w:rFonts w:ascii="Courier New" w:hAnsi="Courier New" w:cs="Courier New"/>
+          <w:lang w:val="nl-NL"/>
+        </w:rPr>
+        <w:t xml:space="preserve">had het boek nog beter gemaakt. </w:t>
+      </w:r>
+      <w:r>
+        <w:rPr>
+          <w:rFonts w:ascii="Courier New" w:hAnsi="Courier New" w:cs="Courier New"/>
+          <w:lang w:val="nl-NL"/>
+        </w:rPr>
+        <w:t xml:space="preserve">Dat gevoel van </w:t>
+      </w:r>
+      <w:r>
+        <w:rPr>
+          <w:rFonts w:ascii="Courier New" w:hAnsi="Courier New" w:cs="Courier New"/>
+          <w:lang w:val="nl-NL"/>
+        </w:rPr>
+        <w:t xml:space="preserve">dit boek is </w:t>
+      </w:r>
+      <w:r>
+        <w:rPr>
+          <w:rFonts w:ascii="Courier New" w:hAnsi="Courier New" w:cs="Courier New"/>
+          <w:lang w:val="nl-NL"/>
+        </w:rPr>
+        <w:t>te lang komt waarschijnlijk ook omdat er</w:t>
+      </w:r>
+      <w:r>
+        <w:rPr>
+          <w:rFonts w:ascii="Courier New" w:hAnsi="Courier New" w:cs="Courier New"/>
+          <w:lang w:val="nl-NL"/>
+        </w:rPr>
+        <w:t xml:space="preserve"> nogal wat mensen </w:t>
+      </w:r>
+      <w:r>
+        <w:rPr>
+          <w:rFonts w:ascii="Courier New" w:hAnsi="Courier New" w:cs="Courier New"/>
+          <w:lang w:val="nl-NL"/>
+        </w:rPr>
+        <w:t xml:space="preserve">in het boek </w:t>
+      </w:r>
+      <w:r>
+        <w:rPr>
+          <w:rFonts w:ascii="Courier New" w:hAnsi="Courier New" w:cs="Courier New"/>
+          <w:lang w:val="nl-NL"/>
+        </w:rPr>
+        <w:t>voorbij</w:t>
+      </w:r>
+      <w:r>
+        <w:rPr>
+          <w:rFonts w:ascii="Courier New" w:hAnsi="Courier New" w:cs="Courier New"/>
+          <w:lang w:val="nl-NL"/>
+        </w:rPr>
+        <w:t>komen.</w:t>
+      </w:r>
+      <w:r>
+        <w:rPr>
+          <w:rFonts w:ascii="Courier New" w:hAnsi="Courier New" w:cs="Courier New"/>
+          <w:lang w:val="nl-NL"/>
+        </w:rPr>
+        <w:t xml:space="preserve"> </w:t>
+      </w:r>
+      <w:r>
+        <w:rPr>
+          <w:rFonts w:ascii="Courier New" w:hAnsi="Courier New" w:cs="Courier New"/>
+          <w:lang w:val="nl-NL"/>
+        </w:rPr>
+        <w:t>S</w:t>
+      </w:r>
+      <w:r>
+        <w:rPr>
+          <w:rFonts w:ascii="Courier New" w:hAnsi="Courier New" w:cs="Courier New"/>
+          <w:lang w:val="nl-NL"/>
+        </w:rPr>
+        <w:t xml:space="preserve">oms is het moeilijk om </w:t>
+      </w:r>
+      <w:r>
+        <w:rPr>
+          <w:rFonts w:ascii="Courier New" w:hAnsi="Courier New" w:cs="Courier New"/>
+          <w:lang w:val="nl-NL"/>
+        </w:rPr>
+        <w:t xml:space="preserve">de draad </w:t>
+      </w:r>
+      <w:r>
+        <w:rPr>
+          <w:rFonts w:ascii="Courier New" w:hAnsi="Courier New" w:cs="Courier New"/>
+          <w:lang w:val="nl-NL"/>
+        </w:rPr>
+        <w:t xml:space="preserve">vast te houden </w:t>
+      </w:r>
+      <w:r>
+        <w:rPr>
+          <w:rFonts w:ascii="Courier New" w:hAnsi="Courier New" w:cs="Courier New"/>
+          <w:lang w:val="nl-NL"/>
+        </w:rPr>
+        <w:t xml:space="preserve">omdat je je als lezer </w:t>
+      </w:r>
+      <w:r>
+        <w:rPr>
+          <w:rFonts w:ascii="Courier New" w:hAnsi="Courier New" w:cs="Courier New"/>
+          <w:lang w:val="nl-NL"/>
+        </w:rPr>
+        <w:t xml:space="preserve">(zeker als je niet uit Amerika komt) </w:t>
+      </w:r>
+      <w:r>
+        <w:rPr>
+          <w:rFonts w:ascii="Courier New" w:hAnsi="Courier New" w:cs="Courier New"/>
+          <w:lang w:val="nl-NL"/>
+        </w:rPr>
+        <w:t xml:space="preserve">afvraagt </w:t>
+      </w:r>
+      <w:r>
+        <w:rPr>
+          <w:rFonts w:ascii="Courier New" w:hAnsi="Courier New" w:cs="Courier New"/>
+          <w:lang w:val="nl-NL"/>
+        </w:rPr>
+        <w:t xml:space="preserve">wie </w:t>
+      </w:r>
+      <w:r>
+        <w:rPr>
+          <w:rFonts w:ascii="Courier New" w:hAnsi="Courier New" w:cs="Courier New"/>
+          <w:lang w:val="nl-NL"/>
+        </w:rPr>
+        <w:t xml:space="preserve">hoort nou precies </w:t>
+      </w:r>
+      <w:r>
+        <w:rPr>
+          <w:rFonts w:ascii="Courier New" w:hAnsi="Courier New" w:cs="Courier New"/>
+          <w:lang w:val="nl-NL"/>
+        </w:rPr>
+        <w:t xml:space="preserve">waar bij. Zoals in een goede, dikke Russische roman </w:t>
+      </w:r>
+      <w:r>
+        <w:rPr>
+          <w:rFonts w:ascii="Courier New" w:hAnsi="Courier New" w:cs="Courier New"/>
+          <w:lang w:val="nl-NL"/>
+        </w:rPr>
+        <w:t xml:space="preserve">heeft Field er </w:t>
+      </w:r>
+      <w:r>
+        <w:rPr>
+          <w:rFonts w:ascii="Courier New" w:hAnsi="Courier New" w:cs="Courier New"/>
+          <w:lang w:val="nl-NL"/>
+        </w:rPr>
+        <w:t xml:space="preserve">terecht aan het begin van </w:t>
+      </w:r>
+      <w:r>
+        <w:rPr>
+          <w:rFonts w:ascii="Courier New" w:hAnsi="Courier New" w:cs="Courier New"/>
+          <w:lang w:val="nl-NL"/>
+        </w:rPr>
+        <w:lastRenderedPageBreak/>
+        <w:t xml:space="preserve">het boek een namenlijst </w:t>
+      </w:r>
+      <w:r>
+        <w:rPr>
+          <w:rFonts w:ascii="Courier New" w:hAnsi="Courier New" w:cs="Courier New"/>
+          <w:lang w:val="nl-NL"/>
+        </w:rPr>
+        <w:t xml:space="preserve">aan </w:t>
+      </w:r>
+      <w:r>
+        <w:rPr>
+          <w:rFonts w:ascii="Courier New" w:hAnsi="Courier New" w:cs="Courier New"/>
+          <w:lang w:val="nl-NL"/>
+        </w:rPr>
+        <w:t>toegevoegd waar je op bepaalde momenten naar terug kunt bladeren</w:t>
+      </w:r>
+      <w:r>
+        <w:rPr>
+          <w:rFonts w:ascii="Courier New" w:hAnsi="Courier New" w:cs="Courier New"/>
+          <w:lang w:val="nl-NL"/>
+        </w:rPr>
+        <w:t xml:space="preserve"> als je het niet meer weet</w:t>
+      </w:r>
+      <w:r>
+        <w:rPr>
+          <w:rFonts w:ascii="Courier New" w:hAnsi="Courier New" w:cs="Courier New"/>
+          <w:lang w:val="nl-NL"/>
+        </w:rPr>
+        <w:t xml:space="preserve">. Maar wat ik in het boek vooral mis is een hoofdstuk over waarom zoveel mensen zich aangetrokken voelen tot dit gedachtengoed. Ze schrijft wel dat liberalen moeite hebben met andere ideeën, maar hier is </w:t>
+      </w:r>
+      <w:r>
+        <w:rPr>
+          <w:rFonts w:ascii="Courier New" w:hAnsi="Courier New" w:cs="Courier New"/>
+          <w:lang w:val="nl-NL"/>
+        </w:rPr>
+        <w:t xml:space="preserve">zoveel </w:t>
+      </w:r>
+      <w:r>
+        <w:rPr>
+          <w:rFonts w:ascii="Courier New" w:hAnsi="Courier New" w:cs="Courier New"/>
+          <w:lang w:val="nl-NL"/>
+        </w:rPr>
+        <w:t>meer over te zeggen</w:t>
+      </w:r>
+      <w:r>
+        <w:rPr>
+          <w:rFonts w:ascii="Courier New" w:hAnsi="Courier New" w:cs="Courier New"/>
+          <w:lang w:val="nl-NL"/>
+        </w:rPr>
+        <w:t xml:space="preserve"> door haar</w:t>
+      </w:r>
+      <w:r>
+        <w:rPr>
+          <w:rFonts w:ascii="Courier New" w:hAnsi="Courier New" w:cs="Courier New"/>
+          <w:lang w:val="nl-NL"/>
+        </w:rPr>
+        <w:t xml:space="preserve">. </w:t>
+      </w:r>
+      <w:r>
+        <w:rPr>
+          <w:rFonts w:ascii="Courier New" w:hAnsi="Courier New" w:cs="Courier New"/>
+          <w:lang w:val="nl-NL"/>
+        </w:rPr>
+        <w:t xml:space="preserve">Blijft staan dat </w:t>
+      </w:r>
+      <w:r>
+        <w:rPr>
+          <w:rFonts w:ascii="Courier New" w:hAnsi="Courier New" w:cs="Courier New"/>
+          <w:lang w:val="nl-NL"/>
+        </w:rPr>
+        <w:t xml:space="preserve">Field ons wel </w:t>
+      </w:r>
+      <w:r>
+        <w:rPr>
+          <w:rFonts w:ascii="Courier New" w:hAnsi="Courier New" w:cs="Courier New"/>
+          <w:lang w:val="nl-NL"/>
+        </w:rPr>
+        <w:t xml:space="preserve">heel </w:t>
+      </w:r>
+      <w:r>
+        <w:rPr>
+          <w:rFonts w:ascii="Courier New" w:hAnsi="Courier New" w:cs="Courier New"/>
+          <w:lang w:val="nl-NL"/>
+        </w:rPr>
+        <w:t xml:space="preserve">veel </w:t>
+      </w:r>
+      <w:r>
+        <w:rPr>
+          <w:rFonts w:ascii="Courier New" w:hAnsi="Courier New" w:cs="Courier New"/>
+          <w:lang w:val="nl-NL"/>
+        </w:rPr>
+        <w:t xml:space="preserve">leert </w:t>
+      </w:r>
+      <w:r>
+        <w:rPr>
+          <w:rFonts w:ascii="Courier New" w:hAnsi="Courier New" w:cs="Courier New"/>
+          <w:lang w:val="nl-NL"/>
+        </w:rPr>
+        <w:t>over deze nieuwe ideeënwereld in Amerika die ook onze eigen wereld binnendringt. De kritische distantie van Field hierbij helpt wel</w:t>
+      </w:r>
+      <w:r>
+        <w:rPr>
+          <w:rFonts w:ascii="Courier New" w:hAnsi="Courier New" w:cs="Courier New"/>
+          <w:lang w:val="nl-NL"/>
+        </w:rPr>
+        <w:t xml:space="preserve"> om </w:t>
+      </w:r>
+      <w:r>
+        <w:rPr>
+          <w:rFonts w:ascii="Courier New" w:hAnsi="Courier New" w:cs="Courier New"/>
+          <w:lang w:val="nl-NL"/>
+        </w:rPr>
+        <w:t xml:space="preserve">je </w:t>
+      </w:r>
+      <w:r>
+        <w:rPr>
+          <w:rFonts w:ascii="Courier New" w:hAnsi="Courier New" w:cs="Courier New"/>
+          <w:lang w:val="nl-NL"/>
+        </w:rPr>
+        <w:t>hierbij staande te blijven</w:t>
+      </w:r>
+      <w:r>
+        <w:rPr>
+          <w:rFonts w:ascii="Courier New" w:hAnsi="Courier New" w:cs="Courier New"/>
+          <w:lang w:val="nl-NL"/>
+        </w:rPr>
+        <w:t xml:space="preserve">. Ik snap heel goed waarom </w:t>
+      </w:r>
+      <w:r>
+        <w:rPr>
+          <w:rFonts w:ascii="Courier New" w:hAnsi="Courier New" w:cs="Courier New"/>
+          <w:lang w:val="nl-NL"/>
+        </w:rPr>
+        <w:t xml:space="preserve">Field </w:t>
+      </w:r>
+      <w:r>
+        <w:rPr>
+          <w:rFonts w:ascii="Courier New" w:hAnsi="Courier New" w:cs="Courier New"/>
+          <w:lang w:val="nl-NL"/>
+        </w:rPr>
+        <w:t xml:space="preserve">dat damestoilet in vluchtte op dat moment </w:t>
+      </w:r>
+      <w:r>
+        <w:rPr>
+          <w:rFonts w:ascii="Courier New" w:hAnsi="Courier New" w:cs="Courier New"/>
+          <w:lang w:val="nl-NL"/>
+        </w:rPr>
+        <w:t>e</w:t>
+      </w:r>
+      <w:r>
+        <w:rPr>
+          <w:rFonts w:ascii="Courier New" w:hAnsi="Courier New" w:cs="Courier New"/>
+          <w:lang w:val="nl-NL"/>
+        </w:rPr>
+        <w:t>n ook dat dat soms helpt</w:t>
+      </w:r>
+      <w:r>
+        <w:rPr>
+          <w:rFonts w:ascii="Courier New" w:hAnsi="Courier New" w:cs="Courier New"/>
+          <w:lang w:val="nl-NL"/>
+        </w:rPr>
+        <w:t xml:space="preserve"> omdat je niks anders kunt doen</w:t>
+      </w:r>
+      <w:r>
+        <w:rPr>
+          <w:rFonts w:ascii="Courier New" w:hAnsi="Courier New" w:cs="Courier New"/>
+          <w:lang w:val="nl-NL"/>
+        </w:rPr>
+        <w:t>. M</w:t>
+      </w:r>
+      <w:r>
+        <w:rPr>
+          <w:rFonts w:ascii="Courier New" w:hAnsi="Courier New" w:cs="Courier New"/>
+          <w:lang w:val="nl-NL"/>
+        </w:rPr>
+        <w:t xml:space="preserve">aar veel beter is om het </w:t>
+      </w:r>
+      <w:r>
+        <w:rPr>
+          <w:rFonts w:ascii="Courier New" w:hAnsi="Courier New" w:cs="Courier New"/>
+          <w:lang w:val="nl-NL"/>
+        </w:rPr>
+        <w:t>goed</w:t>
+      </w:r>
+      <w:r>
+        <w:rPr>
+          <w:rFonts w:ascii="Courier New" w:hAnsi="Courier New" w:cs="Courier New"/>
+          <w:lang w:val="nl-NL"/>
+        </w:rPr>
+        <w:t xml:space="preserve"> te begrijpen </w:t>
+      </w:r>
+      <w:r>
+        <w:rPr>
+          <w:rFonts w:ascii="Courier New" w:hAnsi="Courier New" w:cs="Courier New"/>
+          <w:lang w:val="nl-NL"/>
+        </w:rPr>
+        <w:t xml:space="preserve">wat er om je heen gebeurt </w:t>
+      </w:r>
+      <w:r>
+        <w:rPr>
+          <w:rFonts w:ascii="Courier New" w:hAnsi="Courier New" w:cs="Courier New"/>
+          <w:lang w:val="nl-NL"/>
+        </w:rPr>
+        <w:t xml:space="preserve">en </w:t>
+      </w:r>
+      <w:r>
+        <w:rPr>
+          <w:rFonts w:ascii="Courier New" w:hAnsi="Courier New" w:cs="Courier New"/>
+          <w:lang w:val="nl-NL"/>
+        </w:rPr>
+        <w:t>daar wat</w:t>
+      </w:r>
+      <w:r>
+        <w:rPr>
+          <w:rFonts w:ascii="Courier New" w:hAnsi="Courier New" w:cs="Courier New"/>
+          <w:lang w:val="nl-NL"/>
+        </w:rPr>
+        <w:t xml:space="preserve"> mee te doen. </w:t>
+      </w:r>
+      <w:r>
+        <w:rPr>
+          <w:rFonts w:ascii="Courier New" w:hAnsi="Courier New" w:cs="Courier New"/>
+          <w:lang w:val="nl-NL"/>
+        </w:rPr>
+        <w:t>Dat is wat Laura Field hier heel goed gedaan heeft.</w:t>
       </w:r>
     </w:p>
     <w:p>
@@ -3131,6 +4162,7 @@
       <w:r>
         <w:rPr>
           <w:rFonts w:ascii="Courier New" w:hAnsi="Courier New" w:cs="Courier New"/>
+          <w:lang w:val="nl-NL"/>
         </w:rPr>
         <w:t xml:space="preserve">Field, L.K. (2025). </w:t>
       </w:r>
@@ -3163,352 +4195,6 @@
           <w:lang w:val="nl-NL"/>
         </w:rPr>
         <w:t>: Princeton University Press. 423 pagina’s</w:t>
-      </w:r>
-    </w:p>
-    <w:p>
-      <w:pPr>
-        <w:spacing w:line="360" w:lineRule="auto"/>
-        <w:rPr>
-          <w:rFonts w:ascii="Courier New" w:hAnsi="Courier New" w:cs="Courier New"/>
-          <w:lang w:val="nl-NL"/>
-        </w:rPr>
-      </w:pPr>
-    </w:p>
-    <w:p>
-      <w:pPr>
-        <w:spacing w:line="360" w:lineRule="auto"/>
-        <w:rPr>
-          <w:rFonts w:ascii="Courier New" w:hAnsi="Courier New" w:cs="Courier New"/>
-          <w:lang w:val="nl-NL"/>
-        </w:rPr>
-      </w:pPr>
-      <w:r>
-        <w:rPr>
-          <w:rFonts w:ascii="Courier New" w:hAnsi="Courier New" w:cs="Courier New"/>
-          <w:lang w:val="nl-NL"/>
-        </w:rPr>
-        <w:t>Recensie</w:t>
-      </w:r>
-    </w:p>
-    <w:p>
-      <w:pPr>
-        <w:spacing w:line="360" w:lineRule="auto"/>
-        <w:rPr>
-          <w:rFonts w:ascii="Courier New" w:hAnsi="Courier New" w:cs="Courier New"/>
-          <w:lang w:val="nl-NL"/>
-        </w:rPr>
-      </w:pPr>
-      <w:r>
-        <w:rPr>
-          <w:rFonts w:ascii="Courier New" w:hAnsi="Courier New" w:cs="Courier New"/>
-          <w:lang w:val="nl-NL"/>
-        </w:rPr>
-        <w:t xml:space="preserve">Volgens Field hebben deze groepen twee belangrijke kenmerken gemeen. Ten eerste willen zij een samenhangende morele en politieke visie aan de samenleving opleggen. Zij aanvaarden wat John </w:t>
-      </w:r>
-      <w:proofErr w:type="spellStart"/>
-      <w:r>
-        <w:rPr>
-          <w:rFonts w:ascii="Courier New" w:hAnsi="Courier New" w:cs="Courier New"/>
-          <w:lang w:val="nl-NL"/>
-        </w:rPr>
-        <w:t>Rawls</w:t>
-      </w:r>
-      <w:proofErr w:type="spellEnd"/>
-      <w:r>
-        <w:rPr>
-          <w:rFonts w:ascii="Courier New" w:hAnsi="Courier New" w:cs="Courier New"/>
-          <w:lang w:val="nl-NL"/>
-        </w:rPr>
-        <w:t xml:space="preserve"> een ‘</w:t>
-      </w:r>
-      <w:proofErr w:type="spellStart"/>
-      <w:r>
-        <w:rPr>
-          <w:rFonts w:ascii="Courier New" w:hAnsi="Courier New" w:cs="Courier New"/>
-          <w:lang w:val="nl-NL"/>
-        </w:rPr>
-        <w:t>comprehensive</w:t>
-      </w:r>
-      <w:proofErr w:type="spellEnd"/>
-      <w:r>
-        <w:rPr>
-          <w:rFonts w:ascii="Courier New" w:hAnsi="Courier New" w:cs="Courier New"/>
-          <w:lang w:val="nl-NL"/>
-        </w:rPr>
-        <w:t xml:space="preserve"> doctrine’ noemt: een omvattende opvatting van het goede leven die ook de politiek moet sturen. Overheid, onderwijs en religieuze instellingen mogen volgens hen worden gebruikt om die visie te verwezenlijken. Ten tweede hanteren zij volgens Field een ‘</w:t>
-      </w:r>
-      <w:proofErr w:type="spellStart"/>
-      <w:r>
-        <w:rPr>
-          <w:rFonts w:ascii="Courier New" w:hAnsi="Courier New" w:cs="Courier New"/>
-          <w:lang w:val="nl-NL"/>
-        </w:rPr>
-        <w:t>Ideas</w:t>
-      </w:r>
-      <w:proofErr w:type="spellEnd"/>
-      <w:r>
-        <w:rPr>
-          <w:rFonts w:ascii="Courier New" w:hAnsi="Courier New" w:cs="Courier New"/>
-          <w:lang w:val="nl-NL"/>
-        </w:rPr>
-        <w:t xml:space="preserve"> First’-benadering. Abstracte ideeën over mens, liberalisme, moraal en de Amerikaanse </w:t>
-      </w:r>
-      <w:proofErr w:type="spellStart"/>
-      <w:r>
-        <w:rPr>
-          <w:rFonts w:ascii="Courier New" w:hAnsi="Courier New" w:cs="Courier New"/>
-          <w:lang w:val="nl-NL"/>
-        </w:rPr>
-        <w:t>Founding</w:t>
-      </w:r>
-      <w:proofErr w:type="spellEnd"/>
-      <w:r>
-        <w:rPr>
-          <w:rFonts w:ascii="Courier New" w:hAnsi="Courier New" w:cs="Courier New"/>
-          <w:lang w:val="nl-NL"/>
-        </w:rPr>
-        <w:t xml:space="preserve"> krijgen voorrang boven de complexiteit en </w:t>
-      </w:r>
-      <w:r>
-        <w:rPr>
-          <w:rFonts w:ascii="Courier New" w:hAnsi="Courier New" w:cs="Courier New"/>
-          <w:lang w:val="nl-NL"/>
-        </w:rPr>
-        <w:lastRenderedPageBreak/>
-        <w:t>veranderlijkheid van de werkelijkheid. Field ziet hierin een star idealisme dat kan leiden tot het afdwingen van conformiteit.</w:t>
-      </w:r>
-    </w:p>
-    <w:p>
-      <w:pPr>
-        <w:spacing w:line="360" w:lineRule="auto"/>
-        <w:rPr>
-          <w:rFonts w:ascii="Courier New" w:hAnsi="Courier New" w:cs="Courier New"/>
-          <w:lang w:val="nl-NL"/>
-        </w:rPr>
-      </w:pPr>
-      <w:r>
-        <w:rPr>
-          <w:rFonts w:ascii="Courier New" w:hAnsi="Courier New" w:cs="Courier New"/>
-          <w:lang w:val="nl-NL"/>
-        </w:rPr>
-        <w:t xml:space="preserve">Daartegenover plaatst Field haar liberale pluralisme. De moderne Verenigde Staten kennen zoveel verschillende morele en levensbeschouwelijke overtuigingen dat geen enkele visie op het goede leven politieke voorrang behoort te krijgen. Zelfs als er een objectief juiste moraal zou bestaan, zou het volgens deze benadering onrechtvaardig zijn haar aan andersdenkenden op te leggen. </w:t>
-      </w:r>
-      <w:proofErr w:type="spellStart"/>
-      <w:r>
-        <w:rPr>
-          <w:rFonts w:ascii="Courier New" w:hAnsi="Courier New" w:cs="Courier New"/>
-          <w:lang w:val="nl-NL"/>
-        </w:rPr>
-        <w:t>Liberalism</w:t>
-      </w:r>
-      <w:proofErr w:type="spellEnd"/>
-      <w:r>
-        <w:rPr>
-          <w:rFonts w:ascii="Courier New" w:hAnsi="Courier New" w:cs="Courier New"/>
-          <w:lang w:val="nl-NL"/>
-        </w:rPr>
-        <w:t xml:space="preserve"> betekent daarom ruimte bieden aan redelijke verschillen en uiteenlopende levensvormen.</w:t>
-      </w:r>
-    </w:p>
-    <w:p>
-      <w:pPr>
-        <w:spacing w:line="360" w:lineRule="auto"/>
-        <w:rPr>
-          <w:rFonts w:ascii="Courier New" w:hAnsi="Courier New" w:cs="Courier New"/>
-          <w:lang w:val="nl-NL"/>
-        </w:rPr>
-      </w:pPr>
-      <w:r>
-        <w:rPr>
-          <w:rFonts w:ascii="Courier New" w:hAnsi="Courier New" w:cs="Courier New"/>
-          <w:lang w:val="nl-NL"/>
-        </w:rPr>
-        <w:t>De recensent vindt echter dat Field de intellectuele argumenten van Nieuw Rechts onvoldoende serieus behandelt. Hoewel zij zegt hun ideeën eerlijk te willen beoordelen, reageert zij volgens hem geregeld met spot, persoonlijke afwijzing en kwalificaties in plaats van uitvoerige argumentatie. Vooral wanneer conservatieven klassieke bezwaren tegen relativisme en tolerantie formuleren, zou Field te gemakkelijk aannemen dat liberale filosofen daarop overtuigende antwoorden hebben zonder die antwoorden zelf uit te werken. Daardoor ontstaat volgens de recensent een spanning tussen Fields verdediging van openheid en pluralisme en haar geringe bereidheid om de argumenten van haar tegenstanders werkelijk te onderzoeken.</w:t>
-      </w:r>
-    </w:p>
-    <w:p>
-      <w:pPr>
-        <w:spacing w:line="360" w:lineRule="auto"/>
-        <w:rPr>
-          <w:rFonts w:ascii="Courier New" w:hAnsi="Courier New" w:cs="Courier New"/>
-          <w:lang w:val="nl-NL"/>
-        </w:rPr>
-      </w:pPr>
-      <w:r>
-        <w:rPr>
-          <w:rFonts w:ascii="Courier New" w:hAnsi="Courier New" w:cs="Courier New"/>
-          <w:lang w:val="nl-NL"/>
-        </w:rPr>
-        <w:t xml:space="preserve">Bovendien benadrukt de recensie dat Nieuw Rechts intern veel sterker verdeeld is dan Fields overkoepelende analyse soms suggereert. </w:t>
-      </w:r>
-      <w:proofErr w:type="spellStart"/>
-      <w:r>
-        <w:rPr>
-          <w:rFonts w:ascii="Courier New" w:hAnsi="Courier New" w:cs="Courier New"/>
-          <w:lang w:val="nl-NL"/>
-        </w:rPr>
-        <w:t>Claremonters</w:t>
-      </w:r>
-      <w:proofErr w:type="spellEnd"/>
-      <w:r>
-        <w:rPr>
-          <w:rFonts w:ascii="Courier New" w:hAnsi="Courier New" w:cs="Courier New"/>
-          <w:lang w:val="nl-NL"/>
-        </w:rPr>
-        <w:t xml:space="preserve"> willen terug naar de </w:t>
-      </w:r>
-      <w:proofErr w:type="spellStart"/>
-      <w:r>
-        <w:rPr>
-          <w:rFonts w:ascii="Courier New" w:hAnsi="Courier New" w:cs="Courier New"/>
-          <w:lang w:val="nl-NL"/>
-        </w:rPr>
-        <w:t>Declaration</w:t>
-      </w:r>
-      <w:proofErr w:type="spellEnd"/>
-      <w:r>
-        <w:rPr>
-          <w:rFonts w:ascii="Courier New" w:hAnsi="Courier New" w:cs="Courier New"/>
-          <w:lang w:val="nl-NL"/>
-        </w:rPr>
-        <w:t xml:space="preserve"> of Independence en de administratieve staat afbouwen, terwijl sommige postliberalen diezelfde staatsmacht juist voor christelijke doeleinden willen inzetten. National </w:t>
-      </w:r>
-      <w:proofErr w:type="spellStart"/>
-      <w:r>
-        <w:rPr>
-          <w:rFonts w:ascii="Courier New" w:hAnsi="Courier New" w:cs="Courier New"/>
-          <w:lang w:val="nl-NL"/>
-        </w:rPr>
-        <w:t>Conservatives</w:t>
-      </w:r>
-      <w:proofErr w:type="spellEnd"/>
-      <w:r>
-        <w:rPr>
-          <w:rFonts w:ascii="Courier New" w:hAnsi="Courier New" w:cs="Courier New"/>
-          <w:lang w:val="nl-NL"/>
-        </w:rPr>
-        <w:t xml:space="preserve"> verdedigen de soevereine natiestaat, terwijl bepaalde postliberalen sympathie hebben voor oudere ideeën over universeel rijk of gezag. Ook over Israël, antisemitisme, religie en culturele normen bestaan scherpe conflicten. Een samenhangend regeringsprogramma is daarom allerminst vanzelfsprekend.</w:t>
-      </w:r>
-    </w:p>
-    <w:p>
-      <w:pPr>
-        <w:spacing w:line="360" w:lineRule="auto"/>
-        <w:rPr>
-          <w:rFonts w:ascii="Courier New" w:hAnsi="Courier New" w:cs="Courier New"/>
-          <w:lang w:val="nl-NL"/>
-        </w:rPr>
-      </w:pPr>
-      <w:r>
-        <w:rPr>
-          <w:rFonts w:ascii="Courier New" w:hAnsi="Courier New" w:cs="Courier New"/>
-          <w:lang w:val="nl-NL"/>
-        </w:rPr>
-        <w:lastRenderedPageBreak/>
-        <w:t xml:space="preserve">Het belangrijkste bezwaar van de recensent is dat </w:t>
-      </w:r>
-      <w:proofErr w:type="spellStart"/>
-      <w:r>
-        <w:rPr>
-          <w:rFonts w:ascii="Courier New" w:hAnsi="Courier New" w:cs="Courier New"/>
-          <w:lang w:val="nl-NL"/>
-        </w:rPr>
-        <w:t>Furious</w:t>
-      </w:r>
-      <w:proofErr w:type="spellEnd"/>
-      <w:r>
-        <w:rPr>
-          <w:rFonts w:ascii="Courier New" w:hAnsi="Courier New" w:cs="Courier New"/>
-          <w:lang w:val="nl-NL"/>
-        </w:rPr>
-        <w:t xml:space="preserve"> </w:t>
-      </w:r>
-      <w:proofErr w:type="spellStart"/>
-      <w:r>
-        <w:rPr>
-          <w:rFonts w:ascii="Courier New" w:hAnsi="Courier New" w:cs="Courier New"/>
-          <w:lang w:val="nl-NL"/>
-        </w:rPr>
-        <w:t>Minds</w:t>
-      </w:r>
-      <w:proofErr w:type="spellEnd"/>
-      <w:r>
-        <w:rPr>
-          <w:rFonts w:ascii="Courier New" w:hAnsi="Courier New" w:cs="Courier New"/>
-          <w:lang w:val="nl-NL"/>
-        </w:rPr>
-        <w:t xml:space="preserve"> onvoldoende verklaart waarom Nieuw Rechts zoveel aantrekkingskracht heeft gekregen. Als de analyses van deze beweging werkelijk zo gebrekkig zijn als Field beweert, blijft de vraag waarom steeds meer Amerikanen er toch ontvankelijk voor zijn. Verklaringen die vooral verwijzen naar racisme, blank suprematisme of vatbaarheid voor politieke mythes vindt de recensent ontoereikend. Ook onjuiste politieke overtuigingen moeten vanuit hun maatschappelijke voedingsbodem worden begrepen.</w:t>
-      </w:r>
-    </w:p>
-    <w:p>
-      <w:pPr>
-        <w:spacing w:line="360" w:lineRule="auto"/>
-        <w:rPr>
-          <w:rFonts w:ascii="Courier New" w:hAnsi="Courier New" w:cs="Courier New"/>
-          <w:lang w:val="nl-NL"/>
-        </w:rPr>
-      </w:pPr>
-      <w:r>
-        <w:rPr>
-          <w:rFonts w:ascii="Courier New" w:hAnsi="Courier New" w:cs="Courier New"/>
-          <w:lang w:val="nl-NL"/>
-        </w:rPr>
-        <w:t>Volgens de recensie ligt een belangrijk deel van die voedingsbodem in de ervaring dat het liberale pluralisme in de praktijk minder pluralistisch is dan het zichzelf presenteert. Vooral jongere Amerikanen zouden op universiteiten, in bedrijven en publieke instellingen hebben ervaren dat progressieve opvattingen over ras, diversiteit, identiteit en moraal steeds vaker als vanzelfsprekende normen werden opgelegd. Terwijl liberalen beweren dat de overheid en publieke instellingen geen omvattende moraal mogen voorschrijven, ervaren conservatieven volgens de recensent juist een toenemende progressieve morele homogeniteit. Vanuit dat perspectief wordt de aantrekkingskracht van Nieuw Rechts begrijpelijker: het geeft woorden aan het gevoel dat het beloofde pluralisme niet werkelijk bestaat.</w:t>
-      </w:r>
-    </w:p>
-    <w:p>
-      <w:pPr>
-        <w:spacing w:line="360" w:lineRule="auto"/>
-        <w:rPr>
-          <w:rFonts w:ascii="Courier New" w:hAnsi="Courier New" w:cs="Courier New"/>
-          <w:lang w:val="nl-NL"/>
-        </w:rPr>
-      </w:pPr>
-      <w:r>
-        <w:rPr>
-          <w:rFonts w:ascii="Courier New" w:hAnsi="Courier New" w:cs="Courier New"/>
-          <w:lang w:val="nl-NL"/>
-        </w:rPr>
-        <w:t xml:space="preserve">De ironie is daarom dat een beweging die door Field als gesloten en dogmatisch wordt beschreven erin slaagt nieuwe aanhangers te winnen, terwijl liberalen die openheid, kritisch denken en diversiteit van perspectieven benadrukken moeite hebben andersdenkenden te overtuigen. Field erkent aan het einde volgens de recensent zelf dat liberalen moeite hebben wereldbeelden te begrijpen die sterk van het hunne verschillen. Voor de recensent is juist dat de kern van het probleem. </w:t>
-      </w:r>
-      <w:proofErr w:type="spellStart"/>
-      <w:r>
-        <w:rPr>
-          <w:rFonts w:ascii="Courier New" w:hAnsi="Courier New" w:cs="Courier New"/>
-          <w:lang w:val="nl-NL"/>
-        </w:rPr>
-        <w:t>Furious</w:t>
-      </w:r>
-      <w:proofErr w:type="spellEnd"/>
-      <w:r>
-        <w:rPr>
-          <w:rFonts w:ascii="Courier New" w:hAnsi="Courier New" w:cs="Courier New"/>
-          <w:lang w:val="nl-NL"/>
-        </w:rPr>
-        <w:t xml:space="preserve"> </w:t>
-      </w:r>
-      <w:proofErr w:type="spellStart"/>
-      <w:r>
-        <w:rPr>
-          <w:rFonts w:ascii="Courier New" w:hAnsi="Courier New" w:cs="Courier New"/>
-          <w:lang w:val="nl-NL"/>
-        </w:rPr>
-        <w:t>Minds</w:t>
-      </w:r>
-      <w:proofErr w:type="spellEnd"/>
-      <w:r>
-        <w:rPr>
-          <w:rFonts w:ascii="Courier New" w:hAnsi="Courier New" w:cs="Courier New"/>
-          <w:lang w:val="nl-NL"/>
-        </w:rPr>
-        <w:t xml:space="preserve"> biedt een informatief overzicht van de intellectuele stromingen binnen de MAGA New Right, maar schiet tekort als verklaring van haar groei. Om Nieuw Rechts werkelijk te begrijpen, moet niet alleen worden </w:t>
-      </w:r>
-      <w:r>
-        <w:rPr>
-          <w:rFonts w:ascii="Courier New" w:hAnsi="Courier New" w:cs="Courier New"/>
-          <w:lang w:val="nl-NL"/>
-        </w:rPr>
-        <w:lastRenderedPageBreak/>
-        <w:t>onderzocht wat zijn denkers zeggen, maar ook welke ervaringen met de bestaande liberale orde ervoor zorgen dat hun kritiek bij een groeiend publiek weerklank vindt.</w:t>
       </w:r>
     </w:p>
     <w:p>

</xml_diff>

<commit_message>
26-08-31, Furious minds, bijgeslepen.
</commit_message>
<xml_diff>
--- a/BlogsWord/Strijd_om_ideeen.docx
+++ b/BlogsWord/Strijd_om_ideeen.docx
@@ -130,7 +130,6 @@
         </w:rPr>
         <w:t xml:space="preserve">n </w:t>
       </w:r>
-      <w:proofErr w:type="spellStart"/>
       <w:r>
         <w:rPr>
           <w:rFonts w:ascii="Courier New" w:hAnsi="Courier New" w:cs="Courier New"/>
@@ -138,9 +137,8 @@
           <w:iCs/>
           <w:lang w:val="nl-NL"/>
         </w:rPr>
-        <w:t>Furious</w:t>
-      </w:r>
-      <w:proofErr w:type="spellEnd"/>
+        <w:tab/>
+      </w:r>
       <w:r>
         <w:rPr>
           <w:rFonts w:ascii="Courier New" w:hAnsi="Courier New" w:cs="Courier New"/>
@@ -148,9 +146,8 @@
           <w:iCs/>
           <w:lang w:val="nl-NL"/>
         </w:rPr>
-        <w:t xml:space="preserve"> </w:t>
-      </w:r>
-      <w:proofErr w:type="spellStart"/>
+        <w:tab/>
+      </w:r>
       <w:r>
         <w:rPr>
           <w:rFonts w:ascii="Courier New" w:hAnsi="Courier New" w:cs="Courier New"/>
@@ -158,44 +155,14 @@
           <w:iCs/>
           <w:lang w:val="nl-NL"/>
         </w:rPr>
-        <w:t>Minds</w:t>
-      </w:r>
-      <w:proofErr w:type="spellEnd"/>
-      <w:r>
-        <w:rPr>
-          <w:rFonts w:ascii="Courier New" w:hAnsi="Courier New" w:cs="Courier New"/>
-          <w:i/>
-          <w:iCs/>
-          <w:lang w:val="nl-NL"/>
-        </w:rPr>
-        <w:t xml:space="preserve">: The Making of </w:t>
-      </w:r>
-      <w:proofErr w:type="spellStart"/>
-      <w:r>
-        <w:rPr>
-          <w:rFonts w:ascii="Courier New" w:hAnsi="Courier New" w:cs="Courier New"/>
-          <w:i/>
-          <w:iCs/>
-          <w:lang w:val="nl-NL"/>
-        </w:rPr>
-        <w:t>the</w:t>
-      </w:r>
-      <w:proofErr w:type="spellEnd"/>
-      <w:r>
-        <w:rPr>
-          <w:rFonts w:ascii="Courier New" w:hAnsi="Courier New" w:cs="Courier New"/>
-          <w:i/>
-          <w:iCs/>
-          <w:lang w:val="nl-NL"/>
-        </w:rPr>
-        <w:t xml:space="preserve"> MAGA New Right</w:t>
-      </w:r>
-      <w:r>
-        <w:rPr>
-          <w:rFonts w:ascii="Courier New" w:hAnsi="Courier New" w:cs="Courier New"/>
-          <w:lang w:val="nl-NL"/>
-        </w:rPr>
-        <w:t xml:space="preserve"> de intellectuele wereld die zich </w:t>
+        <w:tab/>
+      </w:r>
+      <w:r>
+        <w:rPr>
+          <w:rFonts w:ascii="Courier New" w:hAnsi="Courier New" w:cs="Courier New"/>
+          <w:lang w:val="nl-NL"/>
+        </w:rPr>
+        <w:t xml:space="preserve">de intellectuele wereld die zich </w:t>
       </w:r>
       <w:r>
         <w:rPr>

</xml_diff>